<commit_message>
docs(manuals): generate complete academic Manual de Despliegue and Manual de Usuario with step-by-step guides, tables, env configs, and role workflows
</commit_message>
<xml_diff>
--- a/docs/entrega/Manuales/Despliegue/Manual_Despliegue.docx
+++ b/docs/entrega/Manuales/Despliegue/Manual_Despliegue.docx
@@ -2,8 +2,6 @@
 <file path=word/document.xml><?xml version="1.0" encoding="utf-8"?>
 <w:document xmlns:wpc="http://schemas.microsoft.com/office/word/2010/wordprocessingCanvas" xmlns:mo="http://schemas.microsoft.com/office/mac/office/2008/main" xmlns:mc="http://schemas.openxmlformats.org/markup-compatibility/2006" xmlns:mv="urn:schemas-microsoft-com:mac:vml" xmlns:o="urn:schemas-microsoft-com:office:office" xmlns:r="http://schemas.openxmlformats.org/officeDocument/2006/relationships" xmlns:m="http://schemas.openxmlformats.org/officeDocument/2006/math" xmlns:v="urn:schemas-microsoft-com:vml" xmlns:wp14="http://schemas.microsoft.com/office/word/2010/wordprocessingDrawing" xmlns:wp="http://schemas.openxmlformats.org/drawingml/2006/wordprocessingDrawing" xmlns:w10="urn:schemas-microsoft-com:office:word" xmlns:w="http://schemas.openxmlformats.org/wordprocessingml/2006/main" xmlns:w14="http://schemas.microsoft.com/office/word/2010/wordml" xmlns:wpg="http://schemas.microsoft.com/office/word/2010/wordprocessingGroup" xmlns:wpi="http://schemas.microsoft.com/office/word/2010/wordprocessingInk" xmlns:wne="http://schemas.microsoft.com/office/word/2006/wordml" xmlns:wps="http://schemas.microsoft.com/office/word/2010/wordprocessingShape" mc:Ignorable="w14 wp14">
   <w:body>
-    <w:p/>
-    <w:p/>
     <w:p>
       <w:pPr>
         <w:spacing w:after="120"/>
@@ -11,10 +9,11 @@
       </w:pPr>
       <w:r>
         <w:rPr>
-          <w:rFonts w:ascii="Times New Roman" w:hAnsi="Times New Roman" w:eastAsia="Times New Roman"/>
+          <w:rFonts w:ascii="Arial" w:hAnsi="Arial"/>
           <w:b/>
           <w:i w:val="0"/>
-          <w:sz w:val="28"/>
+          <w:color w:val="1F3564"/>
+          <w:sz w:val="36"/>
         </w:rPr>
         <w:t>UNIVERSIDAD PRIVADA ANTENOR ORREGO</w:t>
       </w:r>
@@ -26,12 +25,13 @@
       </w:pPr>
       <w:r>
         <w:rPr>
-          <w:rFonts w:ascii="Times New Roman" w:hAnsi="Times New Roman" w:eastAsia="Times New Roman"/>
+          <w:rFonts w:ascii="Arial" w:hAnsi="Arial"/>
           <w:b/>
           <w:i w:val="0"/>
-          <w:sz w:val="24"/>
+          <w:color w:val="475569"/>
+          <w:sz w:val="28"/>
         </w:rPr>
-        <w:t>Facultad de Ingeniería</w:t>
+        <w:t>FACULTAD DE INGENIERÍA</w:t>
       </w:r>
     </w:p>
     <w:p>
@@ -41,12 +41,48 @@
       </w:pPr>
       <w:r>
         <w:rPr>
-          <w:rFonts w:ascii="Times New Roman" w:hAnsi="Times New Roman" w:eastAsia="Times New Roman"/>
+          <w:rFonts w:ascii="Arial" w:hAnsi="Arial"/>
+          <w:b/>
+          <w:i w:val="0"/>
+          <w:color w:val="475569"/>
+          <w:sz w:val="24"/>
+        </w:rPr>
+        <w:t>ESCUELA PROFESIONAL DE INGENIERÍA DE COMPUTACIÓN Y SISTEMAS</w:t>
+      </w:r>
+    </w:p>
+    <w:p/>
+    <w:p/>
+    <w:p/>
+    <w:p>
+      <w:pPr>
+        <w:spacing w:after="120"/>
+        <w:jc w:val="center"/>
+      </w:pPr>
+      <w:r>
+        <w:rPr>
+          <w:rFonts w:ascii="Arial" w:hAnsi="Arial"/>
+          <w:b/>
+          <w:i w:val="0"/>
+          <w:color w:val="1F3564"/>
+          <w:sz w:val="44"/>
+        </w:rPr>
+        <w:t>MANUAL DE DESPLIEGUE TÉCNICO</w:t>
+      </w:r>
+    </w:p>
+    <w:p>
+      <w:pPr>
+        <w:spacing w:after="120"/>
+        <w:jc w:val="center"/>
+      </w:pPr>
+      <w:r>
+        <w:rPr>
+          <w:rFonts w:ascii="Arial" w:hAnsi="Arial"/>
           <w:b w:val="0"/>
-          <w:i w:val="0"/>
-          <w:sz w:val="22"/>
+          <w:i/>
+          <w:color w:val="008080"/>
+          <w:sz w:val="28"/>
         </w:rPr>
-        <w:t>Escuela Profesional de Ingeniería de Computación y Sistemas</w:t>
+        <w:t>Guía Completa de Instalación, Configuración y Puesta en Marcha (Local y Producción)</w:t>
       </w:r>
     </w:p>
     <w:p/>
@@ -57,106 +93,174 @@
       </w:pPr>
       <w:r>
         <w:rPr>
-          <w:rFonts w:ascii="Times New Roman" w:hAnsi="Times New Roman" w:eastAsia="Times New Roman"/>
+          <w:rFonts w:ascii="Arial" w:hAnsi="Arial"/>
           <w:b/>
           <w:i w:val="0"/>
-          <w:sz w:val="32"/>
-        </w:rPr>
-        <w:t>MANUAL DE DESPLIEGUE</w:t>
-      </w:r>
-    </w:p>
-    <w:p>
-      <w:pPr>
-        <w:spacing w:after="120"/>
-        <w:jc w:val="center"/>
-      </w:pPr>
-      <w:r>
-        <w:rPr>
-          <w:rFonts w:ascii="Times New Roman" w:hAnsi="Times New Roman" w:eastAsia="Times New Roman"/>
-          <w:b/>
-          <w:i w:val="0"/>
+          <w:color w:val="334155"/>
           <w:sz w:val="24"/>
         </w:rPr>
-        <w:t>Instalación, configuración y puesta en marcha</w:t>
+        <w:t>“Plataforma de Trazabilidad Académica con Agentes de Inteligencia Artificial Generativa para la Gestión de Proyectos Universitarios de Software”</w:t>
       </w:r>
     </w:p>
     <w:p/>
-    <w:p>
-      <w:pPr>
-        <w:spacing w:after="120"/>
+    <w:p/>
+    <w:p/>
+    <w:p/>
+    <w:tbl>
+      <w:tblPr>
+        <w:tblW w:type="auto" w:w="0"/>
         <w:jc w:val="center"/>
-      </w:pPr>
-      <w:r>
-        <w:rPr>
-          <w:rFonts w:ascii="Times New Roman" w:hAnsi="Times New Roman" w:eastAsia="Times New Roman"/>
-          <w:b w:val="0"/>
-          <w:i/>
-          <w:sz w:val="22"/>
-        </w:rPr>
-        <w:t>Plataforma de Trazabilidad Académica con Agentes de IA Generativa</w:t>
-      </w:r>
-    </w:p>
-    <w:p/>
-    <w:p>
-      <w:pPr>
-        <w:spacing w:after="120"/>
-        <w:jc w:val="center"/>
-      </w:pPr>
-      <w:r>
-        <w:rPr>
-          <w:rFonts w:ascii="Times New Roman" w:hAnsi="Times New Roman" w:eastAsia="Times New Roman"/>
-          <w:b w:val="0"/>
-          <w:i w:val="0"/>
-          <w:sz w:val="22"/>
-        </w:rPr>
-        <w:t>Autor: Jean Marcos Meneses Simón</w:t>
-      </w:r>
-    </w:p>
-    <w:p>
-      <w:pPr>
-        <w:spacing w:after="120"/>
-        <w:jc w:val="center"/>
-      </w:pPr>
-      <w:r>
-        <w:rPr>
-          <w:rFonts w:ascii="Times New Roman" w:hAnsi="Times New Roman" w:eastAsia="Times New Roman"/>
-          <w:b w:val="0"/>
-          <w:i w:val="0"/>
-          <w:sz w:val="22"/>
-        </w:rPr>
-        <w:t>Asesor: Ing. Walter Cueva</w:t>
-      </w:r>
-    </w:p>
-    <w:p>
-      <w:pPr>
-        <w:spacing w:after="120"/>
-        <w:jc w:val="center"/>
-      </w:pPr>
-      <w:r>
-        <w:rPr>
-          <w:rFonts w:ascii="Times New Roman" w:hAnsi="Times New Roman" w:eastAsia="Times New Roman"/>
-          <w:b w:val="0"/>
-          <w:i w:val="0"/>
-          <w:sz w:val="22"/>
-        </w:rPr>
-        <w:t>Fecha: Julio 2026</w:t>
-      </w:r>
-    </w:p>
-    <w:p>
-      <w:pPr>
-        <w:spacing w:after="120"/>
-        <w:jc w:val="center"/>
-      </w:pPr>
-      <w:r>
-        <w:rPr>
-          <w:rFonts w:ascii="Times New Roman" w:hAnsi="Times New Roman" w:eastAsia="Times New Roman"/>
-          <w:b w:val="0"/>
-          <w:i w:val="0"/>
-          <w:sz w:val="20"/>
-        </w:rPr>
-        <w:t>Repositorio: https://github.com/Jmmsimon/trazabilidad-taller-I</w:t>
-      </w:r>
-    </w:p>
+        <w:tblLook w:firstColumn="1" w:firstRow="1" w:lastColumn="0" w:lastRow="0" w:noHBand="0" w:noVBand="1" w:val="04A0"/>
+      </w:tblPr>
+      <w:tblGrid>
+        <w:gridCol w:w="4703"/>
+        <w:gridCol w:w="4703"/>
+      </w:tblGrid>
+      <w:tr>
+        <w:tc>
+          <w:tcPr>
+            <w:tcW w:type="dxa" w:w="4703"/>
+          </w:tcPr>
+          <w:p>
+            <w:r>
+              <w:rPr>
+                <w:rFonts w:ascii="Arial" w:hAnsi="Arial"/>
+                <w:b/>
+                <w:i w:val="0"/>
+                <w:color w:val="1F3564"/>
+                <w:sz w:val="22"/>
+              </w:rPr>
+              <w:t>AUTOR:</w:t>
+            </w:r>
+          </w:p>
+        </w:tc>
+        <w:tc>
+          <w:tcPr>
+            <w:tcW w:type="dxa" w:w="4703"/>
+          </w:tcPr>
+          <w:p>
+            <w:r>
+              <w:rPr>
+                <w:rFonts w:ascii="Arial" w:hAnsi="Arial"/>
+                <w:b w:val="0"/>
+                <w:i w:val="0"/>
+                <w:color w:val="1E293B"/>
+                <w:sz w:val="22"/>
+              </w:rPr>
+              <w:t>Jean Marcos Meneses Simón</w:t>
+            </w:r>
+          </w:p>
+        </w:tc>
+      </w:tr>
+      <w:tr>
+        <w:tc>
+          <w:tcPr>
+            <w:tcW w:type="dxa" w:w="4703"/>
+          </w:tcPr>
+          <w:p>
+            <w:r>
+              <w:rPr>
+                <w:rFonts w:ascii="Arial" w:hAnsi="Arial"/>
+                <w:b/>
+                <w:i w:val="0"/>
+                <w:color w:val="1F3564"/>
+                <w:sz w:val="22"/>
+              </w:rPr>
+              <w:t>ASESOR:</w:t>
+            </w:r>
+          </w:p>
+        </w:tc>
+        <w:tc>
+          <w:tcPr>
+            <w:tcW w:type="dxa" w:w="4703"/>
+          </w:tcPr>
+          <w:p>
+            <w:r>
+              <w:rPr>
+                <w:rFonts w:ascii="Arial" w:hAnsi="Arial"/>
+                <w:b w:val="0"/>
+                <w:i w:val="0"/>
+                <w:color w:val="1E293B"/>
+                <w:sz w:val="22"/>
+              </w:rPr>
+              <w:t>Ing. Walter Cueva Chávez</w:t>
+            </w:r>
+          </w:p>
+        </w:tc>
+      </w:tr>
+      <w:tr>
+        <w:tc>
+          <w:tcPr>
+            <w:tcW w:type="dxa" w:w="4703"/>
+          </w:tcPr>
+          <w:p>
+            <w:r>
+              <w:rPr>
+                <w:rFonts w:ascii="Arial" w:hAnsi="Arial"/>
+                <w:b/>
+                <w:i w:val="0"/>
+                <w:color w:val="1F3564"/>
+                <w:sz w:val="22"/>
+              </w:rPr>
+              <w:t>FECHA:</w:t>
+            </w:r>
+          </w:p>
+        </w:tc>
+        <w:tc>
+          <w:tcPr>
+            <w:tcW w:type="dxa" w:w="4703"/>
+          </w:tcPr>
+          <w:p>
+            <w:r>
+              <w:rPr>
+                <w:rFonts w:ascii="Arial" w:hAnsi="Arial"/>
+                <w:b w:val="0"/>
+                <w:i w:val="0"/>
+                <w:color w:val="1E293B"/>
+                <w:sz w:val="22"/>
+              </w:rPr>
+              <w:t>Julio 2026</w:t>
+            </w:r>
+          </w:p>
+        </w:tc>
+      </w:tr>
+      <w:tr>
+        <w:tc>
+          <w:tcPr>
+            <w:tcW w:type="dxa" w:w="4703"/>
+          </w:tcPr>
+          <w:p>
+            <w:r>
+              <w:rPr>
+                <w:rFonts w:ascii="Arial" w:hAnsi="Arial"/>
+                <w:b/>
+                <w:i w:val="0"/>
+                <w:color w:val="1F3564"/>
+                <w:sz w:val="22"/>
+              </w:rPr>
+              <w:t>REPOSICIÓN DE CÓDIGO:</w:t>
+            </w:r>
+          </w:p>
+        </w:tc>
+        <w:tc>
+          <w:tcPr>
+            <w:tcW w:type="dxa" w:w="4703"/>
+          </w:tcPr>
+          <w:p>
+            <w:r>
+              <w:rPr>
+                <w:rFonts w:ascii="Arial" w:hAnsi="Arial"/>
+                <w:b w:val="0"/>
+                <w:i w:val="0"/>
+                <w:color w:val="1E293B"/>
+                <w:sz w:val="22"/>
+              </w:rPr>
+              <w:t>https://github.com/Jmmsimon/trazabilidad-taller-I</w:t>
+            </w:r>
+          </w:p>
+        </w:tc>
+      </w:tr>
+    </w:tbl>
     <w:p>
       <w:r>
         <w:br w:type="page"/>
@@ -164,16 +268,18 @@
     </w:p>
     <w:p>
       <w:pPr>
-        <w:pStyle w:val="Heading1"/>
+        <w:spacing w:after="160" w:before="280"/>
+        <w:jc w:val="left"/>
       </w:pPr>
       <w:r>
         <w:rPr>
-          <w:rFonts w:ascii="Times New Roman" w:hAnsi="Times New Roman" w:eastAsia="Times New Roman"/>
+          <w:rFonts w:ascii="Arial" w:hAnsi="Arial"/>
           <w:b/>
           <w:i w:val="0"/>
-          <w:sz w:val="28"/>
+          <w:color w:val="1F3564"/>
+          <w:sz w:val="32"/>
         </w:rPr>
-        <w:t>1. Propósito</w:t>
+        <w:t>1. Introducción y Arquitectura del Sistema</w:t>
       </w:r>
     </w:p>
     <w:p>
@@ -183,96 +289,118 @@
       </w:pPr>
       <w:r>
         <w:rPr>
-          <w:rFonts w:ascii="Times New Roman" w:hAnsi="Times New Roman" w:eastAsia="Times New Roman"/>
+          <w:rFonts w:ascii="Arial" w:hAnsi="Arial"/>
           <w:b w:val="0"/>
           <w:i w:val="0"/>
           <w:sz w:val="22"/>
         </w:rPr>
-        <w:t>Este manual describe los requisitos, la configuración de variables de entorno y los pasos para desplegar la plataforma de trazabilidad académica en un entorno local o de producción (frontend Next.js + backend FastAPI).</w:t>
-      </w:r>
-    </w:p>
-    <w:p>
-      <w:pPr>
-        <w:pStyle w:val="Heading1"/>
-      </w:pPr>
-      <w:r>
-        <w:rPr>
-          <w:rFonts w:ascii="Times New Roman" w:hAnsi="Times New Roman" w:eastAsia="Times New Roman"/>
-          <w:b/>
-          <w:i w:val="0"/>
-          <w:sz w:val="28"/>
-        </w:rPr>
-        <w:t>2. Arquitectura de despliegue</w:t>
+        <w:t>La Plataforma de Trazabilidad Académica implementa una arquitectura híbrida moderna de dos capas principales (Frontend React/Next.js 16 con Turbopack y Backend Python FastAPI 0.115+), respaldada por servicios cloud de Google Firebase (Authentication &amp; Cloud Firestore) y orquestación de inteligencia artificial multi-agente con LangGraph.</w:t>
       </w:r>
     </w:p>
     <w:p>
       <w:pPr>
         <w:pStyle w:val="ListBullet"/>
+        <w:spacing w:after="80"/>
       </w:pPr>
       <w:r>
         <w:rPr>
-          <w:rFonts w:ascii="Times New Roman" w:hAnsi="Times New Roman" w:eastAsia="Times New Roman"/>
+          <w:rFonts w:ascii="Arial" w:hAnsi="Arial"/>
+          <w:b/>
+          <w:i w:val="0"/>
+          <w:color w:val="1F3564"/>
+          <w:sz w:val="21"/>
+        </w:rPr>
+        <w:t xml:space="preserve">Frontend Web (Next.js 16 App Router): </w:t>
+      </w:r>
+      <w:r>
+        <w:rPr>
+          <w:rFonts w:ascii="Arial" w:hAnsi="Arial"/>
           <w:b w:val="0"/>
           <w:i w:val="0"/>
-          <w:sz w:val="22"/>
+          <w:sz w:val="21"/>
         </w:rPr>
-        <w:t>Frontend: Next.js 16 (App Router) en el puerto 3000 (desarrollo) o 3000/443 (producción).</w:t>
+        <w:t>Proporciona la interfaz reactiva multi-rol (Estudiante, Docente, Administrador) con soporte SSR/ISR, TailwindCSS v3.4, Lucide React e integración de cliente Firebase SDK.</w:t>
       </w:r>
     </w:p>
     <w:p>
       <w:pPr>
         <w:pStyle w:val="ListBullet"/>
+        <w:spacing w:after="80"/>
       </w:pPr>
       <w:r>
         <w:rPr>
-          <w:rFonts w:ascii="Times New Roman" w:hAnsi="Times New Roman" w:eastAsia="Times New Roman"/>
+          <w:rFonts w:ascii="Arial" w:hAnsi="Arial"/>
+          <w:b/>
+          <w:i w:val="0"/>
+          <w:color w:val="1F3564"/>
+          <w:sz w:val="21"/>
+        </w:rPr>
+        <w:t xml:space="preserve">Backend de Agentes IA (FastAPI &amp; LangGraph): </w:t>
+      </w:r>
+      <w:r>
+        <w:rPr>
+          <w:rFonts w:ascii="Arial" w:hAnsi="Arial"/>
           <w:b w:val="0"/>
           <w:i w:val="0"/>
-          <w:sz w:val="22"/>
+          <w:sz w:val="21"/>
         </w:rPr>
-        <w:t>Backend: FastAPI + Uvicorn en el puerto 8000.</w:t>
+        <w:t>Procesa en segundo plano los flujos de lectura de repositorios Git, normalización de historias de usuario CSV, análisis semántico de commits y generación del Semáforo de Trazabilidad.</w:t>
       </w:r>
     </w:p>
     <w:p>
       <w:pPr>
         <w:pStyle w:val="ListBullet"/>
+        <w:spacing w:after="80"/>
       </w:pPr>
       <w:r>
         <w:rPr>
-          <w:rFonts w:ascii="Times New Roman" w:hAnsi="Times New Roman" w:eastAsia="Times New Roman"/>
+          <w:rFonts w:ascii="Arial" w:hAnsi="Arial"/>
+          <w:b/>
+          <w:i w:val="0"/>
+          <w:color w:val="1F3564"/>
+          <w:sz w:val="21"/>
+        </w:rPr>
+        <w:t xml:space="preserve">Servicios Cloud &amp; Persistencia: </w:t>
+      </w:r>
+      <w:r>
+        <w:rPr>
+          <w:rFonts w:ascii="Arial" w:hAnsi="Arial"/>
+          <w:b w:val="0"/>
+          <w:i w:val="0"/>
+          <w:sz w:val="21"/>
+        </w:rPr>
+        <w:t>Google Cloud Firestore para la base de datos NoSQL de usuarios y proyectos; Firebase Auth para la gestión de tokens JWT y Google OAuth 2.0; GitHub REST/GraphQL API para la sincronización remota.</w:t>
+      </w:r>
+    </w:p>
+    <w:p>
+      <w:pPr>
+        <w:spacing w:after="160" w:before="280"/>
+        <w:jc w:val="left"/>
+      </w:pPr>
+      <w:r>
+        <w:rPr>
+          <w:rFonts w:ascii="Arial" w:hAnsi="Arial"/>
+          <w:b/>
+          <w:i w:val="0"/>
+          <w:color w:val="1F3564"/>
+          <w:sz w:val="32"/>
+        </w:rPr>
+        <w:t>2. Requisitos Previos del Sistema</w:t>
+      </w:r>
+    </w:p>
+    <w:p>
+      <w:pPr>
+        <w:spacing w:after="120"/>
+        <w:jc w:val="both"/>
+      </w:pPr>
+      <w:r>
+        <w:rPr>
+          <w:rFonts w:ascii="Arial" w:hAnsi="Arial"/>
           <w:b w:val="0"/>
           <w:i w:val="0"/>
           <w:sz w:val="22"/>
         </w:rPr>
-        <w:t>Servicios externos: Firebase Authentication/Firestore, GitHub API, LLM (Google Gemini o Anthropic Claude).</w:t>
-      </w:r>
-    </w:p>
-    <w:p>
-      <w:pPr>
-        <w:pStyle w:val="ListBullet"/>
-      </w:pPr>
-      <w:r>
-        <w:rPr>
-          <w:rFonts w:ascii="Times New Roman" w:hAnsi="Times New Roman" w:eastAsia="Times New Roman"/>
-          <w:b w:val="0"/>
-          <w:i w:val="0"/>
-          <w:sz w:val="22"/>
-        </w:rPr>
-        <w:t>El frontend se comunica con el backend mediante API Routes (variable BACKEND_URL).</w:t>
-      </w:r>
-    </w:p>
-    <w:p>
-      <w:pPr>
-        <w:pStyle w:val="Heading1"/>
-      </w:pPr>
-      <w:r>
-        <w:rPr>
-          <w:rFonts w:ascii="Times New Roman" w:hAnsi="Times New Roman" w:eastAsia="Times New Roman"/>
-          <w:b/>
-          <w:i w:val="0"/>
-          <w:sz w:val="28"/>
-        </w:rPr>
-        <w:t>3. Requisitos previos</w:t>
+        <w:t>Para la correcta ejecución del sistema en entornos de desarrollo local o servidores de producción, el host debe cumplir con las siguientes especificaciones técnicas de hardware y software:</w:t>
       </w:r>
     </w:p>
     <w:tbl>
@@ -283,43 +411,71 @@
         <w:tblLook w:firstColumn="1" w:firstRow="1" w:lastColumn="0" w:lastRow="0" w:noHBand="0" w:noVBand="1" w:val="04A0"/>
       </w:tblPr>
       <w:tblGrid>
-        <w:gridCol w:w="4536"/>
-        <w:gridCol w:w="4536"/>
+        <w:gridCol w:w="3135"/>
+        <w:gridCol w:w="3135"/>
+        <w:gridCol w:w="3135"/>
       </w:tblGrid>
       <w:tr>
         <w:tc>
           <w:tcPr>
-            <w:tcW w:type="dxa" w:w="4536"/>
-            <w:shd w:fill="1E3A5F" w:val="clear"/>
+            <w:tcW w:type="dxa" w:w="3135"/>
+            <w:shd w:val="clear" w:color="auto" w:fill="1F3564"/>
           </w:tcPr>
           <w:p>
+            <w:pPr>
+              <w:jc w:val="center"/>
+            </w:pPr>
             <w:r>
               <w:rPr>
-                <w:rFonts w:ascii="Times New Roman" w:hAnsi="Times New Roman" w:eastAsia="Times New Roman"/>
+                <w:rFonts w:ascii="Arial" w:hAnsi="Arial"/>
                 <w:b/>
                 <w:i w:val="0"/>
                 <w:color w:val="FFFFFF"/>
-                <w:sz w:val="18"/>
+                <w:sz w:val="20"/>
               </w:rPr>
-              <w:t>Componente</w:t>
+              <w:t>Componente / Recurso</w:t>
             </w:r>
           </w:p>
         </w:tc>
         <w:tc>
           <w:tcPr>
-            <w:tcW w:type="dxa" w:w="4536"/>
-            <w:shd w:fill="1E3A5F" w:val="clear"/>
+            <w:tcW w:type="dxa" w:w="3135"/>
+            <w:shd w:val="clear" w:color="auto" w:fill="1F3564"/>
           </w:tcPr>
           <w:p>
+            <w:pPr>
+              <w:jc w:val="center"/>
+            </w:pPr>
             <w:r>
               <w:rPr>
-                <w:rFonts w:ascii="Times New Roman" w:hAnsi="Times New Roman" w:eastAsia="Times New Roman"/>
+                <w:rFonts w:ascii="Arial" w:hAnsi="Arial"/>
                 <w:b/>
                 <w:i w:val="0"/>
                 <w:color w:val="FFFFFF"/>
-                <w:sz w:val="18"/>
+                <w:sz w:val="20"/>
               </w:rPr>
-              <w:t>Versión recomendada</w:t>
+              <w:t>Requisito Mínimo</w:t>
+            </w:r>
+          </w:p>
+        </w:tc>
+        <w:tc>
+          <w:tcPr>
+            <w:tcW w:type="dxa" w:w="3135"/>
+            <w:shd w:val="clear" w:color="auto" w:fill="1F3564"/>
+          </w:tcPr>
+          <w:p>
+            <w:pPr>
+              <w:jc w:val="center"/>
+            </w:pPr>
+            <w:r>
+              <w:rPr>
+                <w:rFonts w:ascii="Arial" w:hAnsi="Arial"/>
+                <w:b/>
+                <w:i w:val="0"/>
+                <w:color w:val="FFFFFF"/>
+                <w:sz w:val="20"/>
+              </w:rPr>
+              <w:t>Requisito Recomendado</w:t>
             </w:r>
           </w:p>
         </w:tc>
@@ -327,33 +483,52 @@
       <w:tr>
         <w:tc>
           <w:tcPr>
-            <w:tcW w:type="dxa" w:w="4536"/>
+            <w:tcW w:type="dxa" w:w="2835"/>
+            <w:vAlign w:val="center"/>
           </w:tcPr>
           <w:p>
             <w:r>
               <w:rPr>
-                <w:rFonts w:ascii="Times New Roman" w:hAnsi="Times New Roman" w:eastAsia="Times New Roman"/>
+                <w:rFonts w:ascii="Arial" w:hAnsi="Arial"/>
                 <w:b w:val="0"/>
                 <w:i w:val="0"/>
-                <w:sz w:val="18"/>
+                <w:sz w:val="19"/>
               </w:rPr>
-              <w:t>Node.js</w:t>
+              <w:t>Procesador (CPU)</w:t>
             </w:r>
           </w:p>
         </w:tc>
         <w:tc>
           <w:tcPr>
-            <w:tcW w:type="dxa" w:w="4536"/>
+            <w:tcW w:type="dxa" w:w="2948"/>
+            <w:vAlign w:val="center"/>
           </w:tcPr>
           <w:p>
             <w:r>
               <w:rPr>
-                <w:rFonts w:ascii="Times New Roman" w:hAnsi="Times New Roman" w:eastAsia="Times New Roman"/>
+                <w:rFonts w:ascii="Arial" w:hAnsi="Arial"/>
                 <w:b w:val="0"/>
                 <w:i w:val="0"/>
-                <w:sz w:val="18"/>
+                <w:sz w:val="19"/>
               </w:rPr>
-              <w:t>20 LTS o superior</w:t>
+              <w:t>2 Cores x86_64 / ARM64</w:t>
+            </w:r>
+          </w:p>
+        </w:tc>
+        <w:tc>
+          <w:tcPr>
+            <w:tcW w:type="dxa" w:w="3005"/>
+            <w:vAlign w:val="center"/>
+          </w:tcPr>
+          <w:p>
+            <w:r>
+              <w:rPr>
+                <w:rFonts w:ascii="Arial" w:hAnsi="Arial"/>
+                <w:b w:val="0"/>
+                <w:i w:val="0"/>
+                <w:sz w:val="19"/>
+              </w:rPr>
+              <w:t>4 Cores a 2.5 GHz o superior</w:t>
             </w:r>
           </w:p>
         </w:tc>
@@ -361,33 +536,52 @@
       <w:tr>
         <w:tc>
           <w:tcPr>
-            <w:tcW w:type="dxa" w:w="4536"/>
+            <w:tcW w:type="dxa" w:w="2835"/>
+            <w:vAlign w:val="center"/>
           </w:tcPr>
           <w:p>
             <w:r>
               <w:rPr>
-                <w:rFonts w:ascii="Times New Roman" w:hAnsi="Times New Roman" w:eastAsia="Times New Roman"/>
+                <w:rFonts w:ascii="Arial" w:hAnsi="Arial"/>
                 <w:b w:val="0"/>
                 <w:i w:val="0"/>
-                <w:sz w:val="18"/>
+                <w:sz w:val="19"/>
               </w:rPr>
-              <w:t>npm</w:t>
+              <w:t>Memoria RAM</w:t>
             </w:r>
           </w:p>
         </w:tc>
         <w:tc>
           <w:tcPr>
-            <w:tcW w:type="dxa" w:w="4536"/>
+            <w:tcW w:type="dxa" w:w="2948"/>
+            <w:vAlign w:val="center"/>
           </w:tcPr>
           <w:p>
             <w:r>
               <w:rPr>
-                <w:rFonts w:ascii="Times New Roman" w:hAnsi="Times New Roman" w:eastAsia="Times New Roman"/>
+                <w:rFonts w:ascii="Arial" w:hAnsi="Arial"/>
                 <w:b w:val="0"/>
                 <w:i w:val="0"/>
-                <w:sz w:val="18"/>
+                <w:sz w:val="19"/>
               </w:rPr>
-              <w:t>incluido con Node.js</w:t>
+              <w:t>4 GB RAM libre</w:t>
+            </w:r>
+          </w:p>
+        </w:tc>
+        <w:tc>
+          <w:tcPr>
+            <w:tcW w:type="dxa" w:w="3005"/>
+            <w:vAlign w:val="center"/>
+          </w:tcPr>
+          <w:p>
+            <w:r>
+              <w:rPr>
+                <w:rFonts w:ascii="Arial" w:hAnsi="Arial"/>
+                <w:b w:val="0"/>
+                <w:i w:val="0"/>
+                <w:sz w:val="19"/>
+              </w:rPr>
+              <w:t>8 GB RAM en adelante</w:t>
             </w:r>
           </w:p>
         </w:tc>
@@ -395,33 +589,52 @@
       <w:tr>
         <w:tc>
           <w:tcPr>
-            <w:tcW w:type="dxa" w:w="4536"/>
+            <w:tcW w:type="dxa" w:w="2835"/>
+            <w:vAlign w:val="center"/>
           </w:tcPr>
           <w:p>
             <w:r>
               <w:rPr>
-                <w:rFonts w:ascii="Times New Roman" w:hAnsi="Times New Roman" w:eastAsia="Times New Roman"/>
+                <w:rFonts w:ascii="Arial" w:hAnsi="Arial"/>
                 <w:b w:val="0"/>
                 <w:i w:val="0"/>
-                <w:sz w:val="18"/>
+                <w:sz w:val="19"/>
               </w:rPr>
-              <w:t>Python</w:t>
+              <w:t>Espacio en Disco</w:t>
             </w:r>
           </w:p>
         </w:tc>
         <w:tc>
           <w:tcPr>
-            <w:tcW w:type="dxa" w:w="4536"/>
+            <w:tcW w:type="dxa" w:w="2948"/>
+            <w:vAlign w:val="center"/>
           </w:tcPr>
           <w:p>
             <w:r>
               <w:rPr>
-                <w:rFonts w:ascii="Times New Roman" w:hAnsi="Times New Roman" w:eastAsia="Times New Roman"/>
+                <w:rFonts w:ascii="Arial" w:hAnsi="Arial"/>
                 <w:b w:val="0"/>
                 <w:i w:val="0"/>
-                <w:sz w:val="18"/>
+                <w:sz w:val="19"/>
               </w:rPr>
-              <w:t>3.12</w:t>
+              <w:t>2 GB disponible</w:t>
+            </w:r>
+          </w:p>
+        </w:tc>
+        <w:tc>
+          <w:tcPr>
+            <w:tcW w:type="dxa" w:w="3005"/>
+            <w:vAlign w:val="center"/>
+          </w:tcPr>
+          <w:p>
+            <w:r>
+              <w:rPr>
+                <w:rFonts w:ascii="Arial" w:hAnsi="Arial"/>
+                <w:b w:val="0"/>
+                <w:i w:val="0"/>
+                <w:sz w:val="19"/>
+              </w:rPr>
+              <w:t>5 GB SSD NVMe</w:t>
             </w:r>
           </w:p>
         </w:tc>
@@ -429,33 +642,52 @@
       <w:tr>
         <w:tc>
           <w:tcPr>
-            <w:tcW w:type="dxa" w:w="4536"/>
+            <w:tcW w:type="dxa" w:w="2835"/>
+            <w:vAlign w:val="center"/>
           </w:tcPr>
           <w:p>
             <w:r>
               <w:rPr>
-                <w:rFonts w:ascii="Times New Roman" w:hAnsi="Times New Roman" w:eastAsia="Times New Roman"/>
+                <w:rFonts w:ascii="Arial" w:hAnsi="Arial"/>
                 <w:b w:val="0"/>
                 <w:i w:val="0"/>
-                <w:sz w:val="18"/>
+                <w:sz w:val="19"/>
               </w:rPr>
-              <w:t>Git</w:t>
+              <w:t>Node.js Runtime</w:t>
             </w:r>
           </w:p>
         </w:tc>
         <w:tc>
           <w:tcPr>
-            <w:tcW w:type="dxa" w:w="4536"/>
+            <w:tcW w:type="dxa" w:w="2948"/>
+            <w:vAlign w:val="center"/>
           </w:tcPr>
           <w:p>
             <w:r>
               <w:rPr>
-                <w:rFonts w:ascii="Times New Roman" w:hAnsi="Times New Roman" w:eastAsia="Times New Roman"/>
+                <w:rFonts w:ascii="Arial" w:hAnsi="Arial"/>
                 <w:b w:val="0"/>
                 <w:i w:val="0"/>
-                <w:sz w:val="18"/>
+                <w:sz w:val="19"/>
               </w:rPr>
-              <w:t>2.x</w:t>
+              <w:t>v18.17.0 LTS</w:t>
+            </w:r>
+          </w:p>
+        </w:tc>
+        <w:tc>
+          <w:tcPr>
+            <w:tcW w:type="dxa" w:w="3005"/>
+            <w:vAlign w:val="center"/>
+          </w:tcPr>
+          <w:p>
+            <w:r>
+              <w:rPr>
+                <w:rFonts w:ascii="Arial" w:hAnsi="Arial"/>
+                <w:b w:val="0"/>
+                <w:i w:val="0"/>
+                <w:sz w:val="19"/>
+              </w:rPr>
+              <w:t>v20.11.0 LTS o superior</w:t>
             </w:r>
           </w:p>
         </w:tc>
@@ -463,33 +695,52 @@
       <w:tr>
         <w:tc>
           <w:tcPr>
-            <w:tcW w:type="dxa" w:w="4536"/>
+            <w:tcW w:type="dxa" w:w="2835"/>
+            <w:vAlign w:val="center"/>
           </w:tcPr>
           <w:p>
             <w:r>
               <w:rPr>
-                <w:rFonts w:ascii="Times New Roman" w:hAnsi="Times New Roman" w:eastAsia="Times New Roman"/>
+                <w:rFonts w:ascii="Arial" w:hAnsi="Arial"/>
                 <w:b w:val="0"/>
                 <w:i w:val="0"/>
-                <w:sz w:val="18"/>
+                <w:sz w:val="19"/>
               </w:rPr>
-              <w:t>Cuenta Firebase</w:t>
+              <w:t>Python Runtime</w:t>
             </w:r>
           </w:p>
         </w:tc>
         <w:tc>
           <w:tcPr>
-            <w:tcW w:type="dxa" w:w="4536"/>
+            <w:tcW w:type="dxa" w:w="2948"/>
+            <w:vAlign w:val="center"/>
           </w:tcPr>
           <w:p>
             <w:r>
               <w:rPr>
-                <w:rFonts w:ascii="Times New Roman" w:hAnsi="Times New Roman" w:eastAsia="Times New Roman"/>
+                <w:rFonts w:ascii="Arial" w:hAnsi="Arial"/>
                 <w:b w:val="0"/>
                 <w:i w:val="0"/>
-                <w:sz w:val="18"/>
+                <w:sz w:val="19"/>
               </w:rPr>
-              <w:t>proyecto con Auth + Firestore</w:t>
+              <w:t>v3.10.x</w:t>
+            </w:r>
+          </w:p>
+        </w:tc>
+        <w:tc>
+          <w:tcPr>
+            <w:tcW w:type="dxa" w:w="3005"/>
+            <w:vAlign w:val="center"/>
+          </w:tcPr>
+          <w:p>
+            <w:r>
+              <w:rPr>
+                <w:rFonts w:ascii="Arial" w:hAnsi="Arial"/>
+                <w:b w:val="0"/>
+                <w:i w:val="0"/>
+                <w:sz w:val="19"/>
+              </w:rPr>
+              <w:t>v3.12.x</w:t>
             </w:r>
           </w:p>
         </w:tc>
@@ -497,33 +748,52 @@
       <w:tr>
         <w:tc>
           <w:tcPr>
-            <w:tcW w:type="dxa" w:w="4536"/>
+            <w:tcW w:type="dxa" w:w="2835"/>
+            <w:vAlign w:val="center"/>
           </w:tcPr>
           <w:p>
             <w:r>
               <w:rPr>
-                <w:rFonts w:ascii="Times New Roman" w:hAnsi="Times New Roman" w:eastAsia="Times New Roman"/>
+                <w:rFonts w:ascii="Arial" w:hAnsi="Arial"/>
                 <w:b w:val="0"/>
                 <w:i w:val="0"/>
-                <w:sz w:val="18"/>
+                <w:sz w:val="19"/>
               </w:rPr>
-              <w:t>API Key LLM</w:t>
+              <w:t>Navegador Web</w:t>
             </w:r>
           </w:p>
         </w:tc>
         <w:tc>
           <w:tcPr>
-            <w:tcW w:type="dxa" w:w="4536"/>
+            <w:tcW w:type="dxa" w:w="2948"/>
+            <w:vAlign w:val="center"/>
           </w:tcPr>
           <w:p>
             <w:r>
               <w:rPr>
-                <w:rFonts w:ascii="Times New Roman" w:hAnsi="Times New Roman" w:eastAsia="Times New Roman"/>
+                <w:rFonts w:ascii="Arial" w:hAnsi="Arial"/>
                 <w:b w:val="0"/>
                 <w:i w:val="0"/>
-                <w:sz w:val="18"/>
+                <w:sz w:val="19"/>
               </w:rPr>
-              <w:t>GOOGLE_API_KEY o ANTHROPIC_API_KEY</w:t>
+              <w:t>Google Chrome 115+</w:t>
+            </w:r>
+          </w:p>
+        </w:tc>
+        <w:tc>
+          <w:tcPr>
+            <w:tcW w:type="dxa" w:w="3005"/>
+            <w:vAlign w:val="center"/>
+          </w:tcPr>
+          <w:p>
+            <w:r>
+              <w:rPr>
+                <w:rFonts w:ascii="Arial" w:hAnsi="Arial"/>
+                <w:b w:val="0"/>
+                <w:i w:val="0"/>
+                <w:sz w:val="19"/>
+              </w:rPr>
+              <w:t>Google Chrome v120+ (para Selenium E2E)</w:t>
             </w:r>
           </w:p>
         </w:tc>
@@ -531,121 +801,71 @@
       <w:tr>
         <w:tc>
           <w:tcPr>
-            <w:tcW w:type="dxa" w:w="4536"/>
+            <w:tcW w:type="dxa" w:w="2835"/>
+            <w:vAlign w:val="center"/>
           </w:tcPr>
           <w:p>
             <w:r>
               <w:rPr>
-                <w:rFonts w:ascii="Times New Roman" w:hAnsi="Times New Roman" w:eastAsia="Times New Roman"/>
+                <w:rFonts w:ascii="Arial" w:hAnsi="Arial"/>
                 <w:b w:val="0"/>
                 <w:i w:val="0"/>
-                <w:sz w:val="18"/>
+                <w:sz w:val="19"/>
               </w:rPr>
-              <w:t>Token GitHub (opcional)</w:t>
+              <w:t>Sistema Operativo</w:t>
             </w:r>
           </w:p>
         </w:tc>
         <w:tc>
           <w:tcPr>
-            <w:tcW w:type="dxa" w:w="4536"/>
+            <w:tcW w:type="dxa" w:w="2948"/>
+            <w:vAlign w:val="center"/>
           </w:tcPr>
           <w:p>
             <w:r>
               <w:rPr>
-                <w:rFonts w:ascii="Times New Roman" w:hAnsi="Times New Roman" w:eastAsia="Times New Roman"/>
+                <w:rFonts w:ascii="Arial" w:hAnsi="Arial"/>
                 <w:b w:val="0"/>
                 <w:i w:val="0"/>
-                <w:sz w:val="18"/>
+                <w:sz w:val="19"/>
               </w:rPr>
-              <w:t>para lectura ampliada de repos privados</w:t>
+              <w:t>Windows 10 / Ubuntu 22.04 LTS</w:t>
+            </w:r>
+          </w:p>
+        </w:tc>
+        <w:tc>
+          <w:tcPr>
+            <w:tcW w:type="dxa" w:w="3005"/>
+            <w:vAlign w:val="center"/>
+          </w:tcPr>
+          <w:p>
+            <w:r>
+              <w:rPr>
+                <w:rFonts w:ascii="Arial" w:hAnsi="Arial"/>
+                <w:b w:val="0"/>
+                <w:i w:val="0"/>
+                <w:sz w:val="19"/>
+              </w:rPr>
+              <w:t>Windows 11 / Linux Ubuntu 24.04 LTS</w:t>
             </w:r>
           </w:p>
         </w:tc>
       </w:tr>
     </w:tbl>
-    <w:p/>
     <w:p>
       <w:pPr>
-        <w:pStyle w:val="Heading1"/>
+        <w:spacing w:after="160" w:before="280"/>
+        <w:jc w:val="left"/>
       </w:pPr>
       <w:r>
         <w:rPr>
-          <w:rFonts w:ascii="Times New Roman" w:hAnsi="Times New Roman" w:eastAsia="Times New Roman"/>
+          <w:rFonts w:ascii="Arial" w:hAnsi="Arial"/>
           <w:b/>
           <w:i w:val="0"/>
-          <w:sz w:val="28"/>
+          <w:color w:val="1F3564"/>
+          <w:sz w:val="32"/>
         </w:rPr>
-        <w:t>4. Estructura de entrega</w:t>
-      </w:r>
-    </w:p>
-    <w:p>
-      <w:pPr>
-        <w:pStyle w:val="ListBullet"/>
-      </w:pPr>
-      <w:r>
-        <w:rPr>
-          <w:rFonts w:ascii="Times New Roman" w:hAnsi="Times New Roman" w:eastAsia="Times New Roman"/>
-          <w:b w:val="0"/>
-          <w:i w:val="0"/>
-          <w:sz w:val="22"/>
-        </w:rPr>
-        <w:t>Backend.zip — código del servicio FastAPI (carpeta backend/).</w:t>
-      </w:r>
-    </w:p>
-    <w:p>
-      <w:pPr>
-        <w:pStyle w:val="ListBullet"/>
-      </w:pPr>
-      <w:r>
-        <w:rPr>
-          <w:rFonts w:ascii="Times New Roman" w:hAnsi="Times New Roman" w:eastAsia="Times New Roman"/>
-          <w:b w:val="0"/>
-          <w:i w:val="0"/>
-          <w:sz w:val="22"/>
-        </w:rPr>
-        <w:t>Frontend.zip — código de la aplicación Next.js (raíz del front).</w:t>
-      </w:r>
-    </w:p>
-    <w:p>
-      <w:pPr>
-        <w:pStyle w:val="ListBullet"/>
-      </w:pPr>
-      <w:r>
-        <w:rPr>
-          <w:rFonts w:ascii="Times New Roman" w:hAnsi="Times New Roman" w:eastAsia="Times New Roman"/>
-          <w:b w:val="0"/>
-          <w:i w:val="0"/>
-          <w:sz w:val="22"/>
-        </w:rPr>
-        <w:t>Repositorio Git: https://github.com/Jmmsimon/trazabilidad-taller-I</w:t>
-      </w:r>
-    </w:p>
-    <w:p>
-      <w:pPr>
-        <w:pStyle w:val="Heading1"/>
-      </w:pPr>
-      <w:r>
-        <w:rPr>
-          <w:rFonts w:ascii="Times New Roman" w:hAnsi="Times New Roman" w:eastAsia="Times New Roman"/>
-          <w:b/>
-          <w:i w:val="0"/>
-          <w:sz w:val="28"/>
-        </w:rPr>
-        <w:t>5. Despliegue local — Backend</w:t>
-      </w:r>
-    </w:p>
-    <w:p>
-      <w:pPr>
-        <w:pStyle w:val="Heading2"/>
-      </w:pPr>
-      <w:r>
-        <w:rPr>
-          <w:rFonts w:ascii="Times New Roman" w:hAnsi="Times New Roman" w:eastAsia="Times New Roman"/>
-          <w:b/>
-          <w:i w:val="0"/>
-          <w:sz w:val="24"/>
-        </w:rPr>
-        <w:t>5.1 Extracción e instalación</w:t>
+        <w:t>3. Variables de Entorno y Configuración</w:t>
       </w:r>
     </w:p>
     <w:p>
@@ -655,12 +875,471 @@
       </w:pPr>
       <w:r>
         <w:rPr>
-          <w:rFonts w:ascii="Times New Roman" w:hAnsi="Times New Roman" w:eastAsia="Times New Roman"/>
+          <w:rFonts w:ascii="Arial" w:hAnsi="Arial"/>
           <w:b w:val="0"/>
           <w:i w:val="0"/>
           <w:sz w:val="22"/>
         </w:rPr>
-        <w:t>Desde una terminal en la carpeta del backend:</w:t>
+        <w:t>El sistema requiere dos archivos de configuración de variables de entorno independientes para el Frontend y el Backend.</w:t>
+      </w:r>
+    </w:p>
+    <w:p>
+      <w:pPr>
+        <w:spacing w:after="120" w:before="200"/>
+        <w:jc w:val="left"/>
+      </w:pPr>
+      <w:r>
+        <w:rPr>
+          <w:rFonts w:ascii="Arial" w:hAnsi="Arial"/>
+          <w:b/>
+          <w:i w:val="0"/>
+          <w:color w:val="008080"/>
+          <w:sz w:val="26"/>
+        </w:rPr>
+        <w:t>3.1 Configuración Frontend (.env.local)</w:t>
+      </w:r>
+    </w:p>
+    <w:tbl>
+      <w:tblPr>
+        <w:tblW w:type="auto" w:w="0"/>
+        <w:jc w:val="center"/>
+        <w:tblLook w:firstColumn="1" w:firstRow="1" w:lastColumn="0" w:lastRow="0" w:noHBand="0" w:noVBand="1" w:val="04A0"/>
+      </w:tblPr>
+      <w:tblGrid>
+        <w:gridCol w:w="9406"/>
+      </w:tblGrid>
+      <w:tr>
+        <w:tc>
+          <w:tcPr>
+            <w:tcW w:type="dxa" w:w="8787"/>
+            <w:shd w:val="clear" w:color="auto" w:fill="1E293B"/>
+          </w:tcPr>
+          <w:p>
+            <w:pPr>
+              <w:spacing w:before="120" w:after="120"/>
+            </w:pPr>
+            <w:r>
+              <w:rPr>
+                <w:rFonts w:ascii="Consolas" w:hAnsi="Consolas"/>
+                <w:b w:val="0"/>
+                <w:i w:val="0"/>
+                <w:color w:val="F1F5F9"/>
+                <w:sz w:val="19"/>
+              </w:rPr>
+              <w:t>NEXT_PUBLIC_FIREBASE_API_KEY=AIzaSyA...</w:t>
+              <w:br/>
+              <w:t>NEXT_PUBLIC_FIREBASE_AUTH_DOMAIN=trazabilidad-taller.firebaseapp.com</w:t>
+              <w:br/>
+              <w:t>NEXT_PUBLIC_FIREBASE_PROJECT_ID=trazabilidad-taller</w:t>
+              <w:br/>
+              <w:t>NEXT_PUBLIC_FIREBASE_STORAGE_BUCKET=trazabilidad-taller.appspot.com</w:t>
+              <w:br/>
+              <w:t>NEXT_PUBLIC_FIREBASE_MESSAGING_SENDER_ID=1092837465</w:t>
+              <w:br/>
+              <w:t>NEXT_PUBLIC_FIREBASE_APP_ID=1:1092837465:web:abcd1234efgh</w:t>
+              <w:br/>
+              <w:t>NEXT_PUBLIC_BACKEND_URL=http://localhost:8000</w:t>
+            </w:r>
+          </w:p>
+        </w:tc>
+      </w:tr>
+    </w:tbl>
+    <w:p>
+      <w:pPr>
+        <w:spacing w:after="80"/>
+      </w:pPr>
+    </w:p>
+    <w:p>
+      <w:pPr>
+        <w:spacing w:after="120" w:before="200"/>
+        <w:jc w:val="left"/>
+      </w:pPr>
+      <w:r>
+        <w:rPr>
+          <w:rFonts w:ascii="Arial" w:hAnsi="Arial"/>
+          <w:b/>
+          <w:i w:val="0"/>
+          <w:color w:val="008080"/>
+          <w:sz w:val="26"/>
+        </w:rPr>
+        <w:t>3.2 Configuración Backend (backend/.env)</w:t>
+      </w:r>
+    </w:p>
+    <w:tbl>
+      <w:tblPr>
+        <w:tblW w:type="auto" w:w="0"/>
+        <w:jc w:val="center"/>
+        <w:tblLook w:firstColumn="1" w:firstRow="1" w:lastColumn="0" w:lastRow="0" w:noHBand="0" w:noVBand="1" w:val="04A0"/>
+      </w:tblPr>
+      <w:tblGrid>
+        <w:gridCol w:w="9406"/>
+      </w:tblGrid>
+      <w:tr>
+        <w:tc>
+          <w:tcPr>
+            <w:tcW w:type="dxa" w:w="8787"/>
+            <w:shd w:val="clear" w:color="auto" w:fill="1E293B"/>
+          </w:tcPr>
+          <w:p>
+            <w:pPr>
+              <w:spacing w:before="120" w:after="120"/>
+            </w:pPr>
+            <w:r>
+              <w:rPr>
+                <w:rFonts w:ascii="Consolas" w:hAnsi="Consolas"/>
+                <w:b w:val="0"/>
+                <w:i w:val="0"/>
+                <w:color w:val="F1F5F9"/>
+                <w:sz w:val="19"/>
+              </w:rPr>
+              <w:t>FIREBASE_CREDENTIALS_PATH=serviceAccountKey.json</w:t>
+              <w:br/>
+              <w:t>GITHUB_TOKEN=github_pat_11A...</w:t>
+              <w:br/>
+              <w:t>GEMINI_API_KEY=AIzaSyB...</w:t>
+              <w:br/>
+              <w:t>ANTHROPIC_API_KEY=sk-ant-api03-...</w:t>
+              <w:br/>
+              <w:t>PORT=8000</w:t>
+              <w:br/>
+              <w:t>HOST=0.0.0.0</w:t>
+              <w:br/>
+              <w:t>CORS_ORIGINS=http://localhost:3000,https://trazabilidad-app.vercel.app</w:t>
+            </w:r>
+          </w:p>
+        </w:tc>
+      </w:tr>
+    </w:tbl>
+    <w:p>
+      <w:pPr>
+        <w:spacing w:after="80"/>
+      </w:pPr>
+    </w:p>
+    <w:tbl>
+      <w:tblPr>
+        <w:tblW w:type="auto" w:w="0"/>
+        <w:jc w:val="center"/>
+        <w:tblLook w:firstColumn="1" w:firstRow="1" w:lastColumn="0" w:lastRow="0" w:noHBand="0" w:noVBand="1" w:val="04A0"/>
+      </w:tblPr>
+      <w:tblGrid>
+        <w:gridCol w:w="9406"/>
+      </w:tblGrid>
+      <w:tr>
+        <w:tc>
+          <w:tcPr>
+            <w:tcW w:type="dxa" w:w="8787"/>
+            <w:shd w:val="clear" w:color="auto" w:fill="E0F2FE"/>
+          </w:tcPr>
+          <w:p>
+            <w:pPr>
+              <w:spacing w:before="120" w:after="120"/>
+            </w:pPr>
+            <w:r>
+              <w:rPr>
+                <w:rFonts w:ascii="Arial" w:hAnsi="Arial"/>
+                <w:b/>
+                <w:i w:val="0"/>
+                <w:color w:val="0369A1"/>
+                <w:sz w:val="20"/>
+              </w:rPr>
+              <w:t xml:space="preserve">NOTA IMPORTANTE: </w:t>
+            </w:r>
+            <w:r>
+              <w:rPr>
+                <w:rFonts w:ascii="Arial" w:hAnsi="Arial"/>
+                <w:b w:val="0"/>
+                <w:i/>
+                <w:color w:val="0F172A"/>
+                <w:sz w:val="20"/>
+              </w:rPr>
+              <w:t>Nunca incluya credenciales ni llaves privadas reales (.env o serviceAccountKey.json) en repositorios públicos de GitHub. Use plantillas .env.example para compartir la estructura.</w:t>
+            </w:r>
+          </w:p>
+        </w:tc>
+      </w:tr>
+    </w:tbl>
+    <w:p>
+      <w:pPr>
+        <w:spacing w:after="80"/>
+      </w:pPr>
+    </w:p>
+    <w:p>
+      <w:pPr>
+        <w:spacing w:after="160" w:before="280"/>
+        <w:jc w:val="left"/>
+      </w:pPr>
+      <w:r>
+        <w:rPr>
+          <w:rFonts w:ascii="Arial" w:hAnsi="Arial"/>
+          <w:b/>
+          <w:i w:val="0"/>
+          <w:color w:val="1F3564"/>
+          <w:sz w:val="32"/>
+        </w:rPr>
+        <w:t>4. Instalación y Puesta en Marcha Local Paso a Paso</w:t>
+      </w:r>
+    </w:p>
+    <w:p>
+      <w:pPr>
+        <w:spacing w:after="120" w:before="200"/>
+        <w:jc w:val="left"/>
+      </w:pPr>
+      <w:r>
+        <w:rPr>
+          <w:rFonts w:ascii="Arial" w:hAnsi="Arial"/>
+          <w:b/>
+          <w:i w:val="0"/>
+          <w:color w:val="008080"/>
+          <w:sz w:val="26"/>
+        </w:rPr>
+        <w:t>Paso 1: Clonar el Repositorio Oficial</w:t>
+      </w:r>
+    </w:p>
+    <w:tbl>
+      <w:tblPr>
+        <w:tblW w:type="auto" w:w="0"/>
+        <w:jc w:val="center"/>
+        <w:tblLook w:firstColumn="1" w:firstRow="1" w:lastColumn="0" w:lastRow="0" w:noHBand="0" w:noVBand="1" w:val="04A0"/>
+      </w:tblPr>
+      <w:tblGrid>
+        <w:gridCol w:w="9406"/>
+      </w:tblGrid>
+      <w:tr>
+        <w:tc>
+          <w:tcPr>
+            <w:tcW w:type="dxa" w:w="8787"/>
+            <w:shd w:val="clear" w:color="auto" w:fill="1E293B"/>
+          </w:tcPr>
+          <w:p>
+            <w:pPr>
+              <w:spacing w:before="120" w:after="120"/>
+            </w:pPr>
+            <w:r>
+              <w:rPr>
+                <w:rFonts w:ascii="Consolas" w:hAnsi="Consolas"/>
+                <w:b w:val="0"/>
+                <w:i w:val="0"/>
+                <w:color w:val="F1F5F9"/>
+                <w:sz w:val="19"/>
+              </w:rPr>
+              <w:t>git clone https://github.com/Jmmsimon/trazabilidad-taller-I.git</w:t>
+              <w:br/>
+              <w:t>cd trazabilidad-taller-I</w:t>
+            </w:r>
+          </w:p>
+        </w:tc>
+      </w:tr>
+    </w:tbl>
+    <w:p>
+      <w:pPr>
+        <w:spacing w:after="80"/>
+      </w:pPr>
+    </w:p>
+    <w:p>
+      <w:pPr>
+        <w:spacing w:after="120" w:before="200"/>
+        <w:jc w:val="left"/>
+      </w:pPr>
+      <w:r>
+        <w:rPr>
+          <w:rFonts w:ascii="Arial" w:hAnsi="Arial"/>
+          <w:b/>
+          <w:i w:val="0"/>
+          <w:color w:val="008080"/>
+          <w:sz w:val="26"/>
+        </w:rPr>
+        <w:t>Paso 2: Configurar e Iniciar el Backend (FastAPI)</w:t>
+      </w:r>
+    </w:p>
+    <w:tbl>
+      <w:tblPr>
+        <w:tblW w:type="auto" w:w="0"/>
+        <w:jc w:val="center"/>
+        <w:tblLook w:firstColumn="1" w:firstRow="1" w:lastColumn="0" w:lastRow="0" w:noHBand="0" w:noVBand="1" w:val="04A0"/>
+      </w:tblPr>
+      <w:tblGrid>
+        <w:gridCol w:w="9406"/>
+      </w:tblGrid>
+      <w:tr>
+        <w:tc>
+          <w:tcPr>
+            <w:tcW w:type="dxa" w:w="8787"/>
+            <w:shd w:val="clear" w:color="auto" w:fill="1E293B"/>
+          </w:tcPr>
+          <w:p>
+            <w:pPr>
+              <w:spacing w:before="120" w:after="120"/>
+            </w:pPr>
+            <w:r>
+              <w:rPr>
+                <w:rFonts w:ascii="Consolas" w:hAnsi="Consolas"/>
+                <w:b w:val="0"/>
+                <w:i w:val="0"/>
+                <w:color w:val="F1F5F9"/>
+                <w:sz w:val="19"/>
+              </w:rPr>
+              <w:t>cd backend</w:t>
+              <w:br/>
+              <w:t>python -m venv .venv</w:t>
+              <w:br/>
+              <w:t># En Windows:</w:t>
+              <w:br/>
+              <w:t>.venv\Scripts\activate</w:t>
+              <w:br/>
+              <w:t># En Linux/macOS:</w:t>
+              <w:br/>
+              <w:t>source .venv/bin/activate</w:t>
+              <w:br/>
+              <w:t>pip install -r requirements.txt</w:t>
+              <w:br/>
+              <w:t>python -m uvicorn main:app --reload --port 8000</w:t>
+            </w:r>
+          </w:p>
+        </w:tc>
+      </w:tr>
+    </w:tbl>
+    <w:p>
+      <w:pPr>
+        <w:spacing w:after="80"/>
+      </w:pPr>
+    </w:p>
+    <w:p>
+      <w:pPr>
+        <w:spacing w:after="120" w:before="200"/>
+        <w:jc w:val="left"/>
+      </w:pPr>
+      <w:r>
+        <w:rPr>
+          <w:rFonts w:ascii="Arial" w:hAnsi="Arial"/>
+          <w:b/>
+          <w:i w:val="0"/>
+          <w:color w:val="008080"/>
+          <w:sz w:val="26"/>
+        </w:rPr>
+        <w:t>Paso 3: Configurar e Iniciar el Frontend (Next.js)</w:t>
+      </w:r>
+    </w:p>
+    <w:tbl>
+      <w:tblPr>
+        <w:tblW w:type="auto" w:w="0"/>
+        <w:jc w:val="center"/>
+        <w:tblLook w:firstColumn="1" w:firstRow="1" w:lastColumn="0" w:lastRow="0" w:noHBand="0" w:noVBand="1" w:val="04A0"/>
+      </w:tblPr>
+      <w:tblGrid>
+        <w:gridCol w:w="9406"/>
+      </w:tblGrid>
+      <w:tr>
+        <w:tc>
+          <w:tcPr>
+            <w:tcW w:type="dxa" w:w="8787"/>
+            <w:shd w:val="clear" w:color="auto" w:fill="1E293B"/>
+          </w:tcPr>
+          <w:p>
+            <w:pPr>
+              <w:spacing w:before="120" w:after="120"/>
+            </w:pPr>
+            <w:r>
+              <w:rPr>
+                <w:rFonts w:ascii="Consolas" w:hAnsi="Consolas"/>
+                <w:b w:val="0"/>
+                <w:i w:val="0"/>
+                <w:color w:val="F1F5F9"/>
+                <w:sz w:val="19"/>
+              </w:rPr>
+              <w:t># En la raíz del proyecto:</w:t>
+              <w:br/>
+              <w:t>npm install</w:t>
+              <w:br/>
+              <w:t>npm run dev</w:t>
+            </w:r>
+          </w:p>
+        </w:tc>
+      </w:tr>
+    </w:tbl>
+    <w:p>
+      <w:pPr>
+        <w:spacing w:after="80"/>
+      </w:pPr>
+    </w:p>
+    <w:p>
+      <w:pPr>
+        <w:spacing w:after="120"/>
+        <w:jc w:val="both"/>
+      </w:pPr>
+      <w:r>
+        <w:rPr>
+          <w:rFonts w:ascii="Arial" w:hAnsi="Arial"/>
+          <w:b w:val="0"/>
+          <w:i w:val="0"/>
+          <w:sz w:val="22"/>
+        </w:rPr>
+        <w:t>Una vez iniciados ambos servicios, la aplicación estará accesible localmente en:</w:t>
+      </w:r>
+    </w:p>
+    <w:p>
+      <w:pPr>
+        <w:pStyle w:val="ListBullet"/>
+        <w:spacing w:after="80"/>
+      </w:pPr>
+      <w:r>
+        <w:rPr>
+          <w:rFonts w:ascii="Arial" w:hAnsi="Arial"/>
+          <w:b/>
+          <w:i w:val="0"/>
+          <w:color w:val="1F3564"/>
+          <w:sz w:val="21"/>
+        </w:rPr>
+        <w:t xml:space="preserve">Portal Frontend Web: </w:t>
+      </w:r>
+      <w:r>
+        <w:rPr>
+          <w:rFonts w:ascii="Arial" w:hAnsi="Arial"/>
+          <w:b w:val="0"/>
+          <w:i w:val="0"/>
+          <w:sz w:val="21"/>
+        </w:rPr>
+        <w:t>http://localhost:3000</w:t>
+      </w:r>
+    </w:p>
+    <w:p>
+      <w:pPr>
+        <w:pStyle w:val="ListBullet"/>
+        <w:spacing w:after="80"/>
+      </w:pPr>
+      <w:r>
+        <w:rPr>
+          <w:rFonts w:ascii="Arial" w:hAnsi="Arial"/>
+          <w:b/>
+          <w:i w:val="0"/>
+          <w:color w:val="1F3564"/>
+          <w:sz w:val="21"/>
+        </w:rPr>
+        <w:t xml:space="preserve">Documentación OpenAPI Backend: </w:t>
+      </w:r>
+      <w:r>
+        <w:rPr>
+          <w:rFonts w:ascii="Arial" w:hAnsi="Arial"/>
+          <w:b w:val="0"/>
+          <w:i w:val="0"/>
+          <w:sz w:val="21"/>
+        </w:rPr>
+        <w:t>http://localhost:8000/docs</w:t>
+      </w:r>
+    </w:p>
+    <w:p>
+      <w:pPr>
+        <w:spacing w:after="160" w:before="280"/>
+        <w:jc w:val="left"/>
+      </w:pPr>
+      <w:r>
+        <w:rPr>
+          <w:rFonts w:ascii="Arial" w:hAnsi="Arial"/>
+          <w:b/>
+          <w:i w:val="0"/>
+          <w:color w:val="1F3564"/>
+          <w:sz w:val="32"/>
+        </w:rPr>
+        <w:t>5. Despliegue en Entornos de Producción Cloud</w:t>
       </w:r>
     </w:p>
     <w:p>
@@ -670,32 +1349,103 @@
       </w:pPr>
       <w:r>
         <w:rPr>
-          <w:rFonts w:ascii="Times New Roman" w:hAnsi="Times New Roman" w:eastAsia="Times New Roman"/>
+          <w:rFonts w:ascii="Arial" w:hAnsi="Arial"/>
           <w:b w:val="0"/>
           <w:i w:val="0"/>
-          <w:sz w:val="18"/>
+          <w:sz w:val="22"/>
         </w:rPr>
-        <w:t>python -m venv .venv</w:t>
-        <w:br/>
-        <w:t># Windows (Git Bash / PowerShell):</w:t>
-        <w:br/>
-        <w:t>source .venv/Scripts/activate   # o .venv\Scripts\Activate.ps1</w:t>
-        <w:br/>
-        <w:t>pip install -r requirements.txt</w:t>
+        <w:t>Para el entorno de producción en la nube, se adopta un despliegue desacoplado serverless de alta disponibilidad:</w:t>
       </w:r>
     </w:p>
     <w:p>
       <w:pPr>
-        <w:pStyle w:val="Heading2"/>
+        <w:pStyle w:val="ListBullet"/>
+        <w:spacing w:after="80"/>
       </w:pPr>
       <w:r>
         <w:rPr>
-          <w:rFonts w:ascii="Times New Roman" w:hAnsi="Times New Roman" w:eastAsia="Times New Roman"/>
+          <w:rFonts w:ascii="Arial" w:hAnsi="Arial"/>
           <w:b/>
           <w:i w:val="0"/>
-          <w:sz w:val="24"/>
+          <w:color w:val="1F3564"/>
+          <w:sz w:val="21"/>
         </w:rPr>
-        <w:t>5.2 Credenciales Firebase (Admin SDK)</w:t>
+        <w:t xml:space="preserve">Despliegue Frontend en Vercel Platform: </w:t>
+      </w:r>
+      <w:r>
+        <w:rPr>
+          <w:rFonts w:ascii="Arial" w:hAnsi="Arial"/>
+          <w:b w:val="0"/>
+          <w:i w:val="0"/>
+          <w:sz w:val="21"/>
+        </w:rPr>
+        <w:t>Conexión automática mediante integración GitHub CI/CD. Build command: `npm run build`, Output directory: `.next`.</w:t>
+      </w:r>
+    </w:p>
+    <w:p>
+      <w:pPr>
+        <w:pStyle w:val="ListBullet"/>
+        <w:spacing w:after="80"/>
+      </w:pPr>
+      <w:r>
+        <w:rPr>
+          <w:rFonts w:ascii="Arial" w:hAnsi="Arial"/>
+          <w:b/>
+          <w:i w:val="0"/>
+          <w:color w:val="1F3564"/>
+          <w:sz w:val="21"/>
+        </w:rPr>
+        <w:t xml:space="preserve">Despliegue Backend en Cloud Run / Render / Railway: </w:t>
+      </w:r>
+      <w:r>
+        <w:rPr>
+          <w:rFonts w:ascii="Arial" w:hAnsi="Arial"/>
+          <w:b w:val="0"/>
+          <w:i w:val="0"/>
+          <w:sz w:val="21"/>
+        </w:rPr>
+        <w:t>Despliegue del contenedor Docker de FastAPI o servicio Web Service de Python 3.12 con soporte de variables de entorno seguras.</w:t>
+      </w:r>
+    </w:p>
+    <w:p>
+      <w:pPr>
+        <w:pStyle w:val="ListBullet"/>
+        <w:spacing w:after="80"/>
+      </w:pPr>
+      <w:r>
+        <w:rPr>
+          <w:rFonts w:ascii="Arial" w:hAnsi="Arial"/>
+          <w:b/>
+          <w:i w:val="0"/>
+          <w:color w:val="1F3564"/>
+          <w:sz w:val="21"/>
+        </w:rPr>
+        <w:t xml:space="preserve">Base de Datos Cloud Firestore: </w:t>
+      </w:r>
+      <w:r>
+        <w:rPr>
+          <w:rFonts w:ascii="Arial" w:hAnsi="Arial"/>
+          <w:b w:val="0"/>
+          <w:i w:val="0"/>
+          <w:sz w:val="21"/>
+        </w:rPr>
+        <w:t>Modo de producción activado en Firebase Console con reglas de seguridad Firestore (Security Rules) restringiendo lecturas/escrituras según JWT del usuario autenticado.</w:t>
+      </w:r>
+    </w:p>
+    <w:p>
+      <w:pPr>
+        <w:spacing w:after="160" w:before="280"/>
+        <w:jc w:val="left"/>
+      </w:pPr>
+      <w:r>
+        <w:rPr>
+          <w:rFonts w:ascii="Arial" w:hAnsi="Arial"/>
+          <w:b/>
+          <w:i w:val="0"/>
+          <w:color w:val="1F3564"/>
+          <w:sz w:val="32"/>
+        </w:rPr>
+        <w:t>6. Suite de Pruebas y Verificación del Despliegue</w:t>
       </w:r>
     </w:p>
     <w:p>
@@ -705,41 +1455,78 @@
       </w:pPr>
       <w:r>
         <w:rPr>
-          <w:rFonts w:ascii="Times New Roman" w:hAnsi="Times New Roman" w:eastAsia="Times New Roman"/>
+          <w:rFonts w:ascii="Arial" w:hAnsi="Arial"/>
           <w:b w:val="0"/>
           <w:i w:val="0"/>
           <w:sz w:val="22"/>
         </w:rPr>
-        <w:t>Colocar el archivo serviceAccountKey.json dentro de la carpeta backend/ (descargado desde Firebase Console → Configuración del proyecto → Cuentas de servicio). En producción puede usarse la variable de entorno FIREBASE_CREDENTIALS con el JSON completo.</w:t>
+        <w:t>Para comprobar la integridad del despliegue en un entorno recién instalado, ejecute la suite de verificación automatizada:</w:t>
       </w:r>
+    </w:p>
+    <w:tbl>
+      <w:tblPr>
+        <w:tblW w:type="auto" w:w="0"/>
+        <w:jc w:val="center"/>
+        <w:tblLook w:firstColumn="1" w:firstRow="1" w:lastColumn="0" w:lastRow="0" w:noHBand="0" w:noVBand="1" w:val="04A0"/>
+      </w:tblPr>
+      <w:tblGrid>
+        <w:gridCol w:w="9406"/>
+      </w:tblGrid>
+      <w:tr>
+        <w:tc>
+          <w:tcPr>
+            <w:tcW w:type="dxa" w:w="8787"/>
+            <w:shd w:val="clear" w:color="auto" w:fill="1E293B"/>
+          </w:tcPr>
+          <w:p>
+            <w:pPr>
+              <w:spacing w:before="120" w:after="120"/>
+            </w:pPr>
+            <w:r>
+              <w:rPr>
+                <w:rFonts w:ascii="Consolas" w:hAnsi="Consolas"/>
+                <w:b w:val="0"/>
+                <w:i w:val="0"/>
+                <w:color w:val="F1F5F9"/>
+                <w:sz w:val="19"/>
+              </w:rPr>
+              <w:t># 1. Ejecutar Pruebas Unitarias Pytest Backend</w:t>
+              <w:br/>
+              <w:t>pytest backend/tests/</w:t>
+              <w:br/>
+              <w:br/>
+              <w:t># 2. Ejecutar Pruebas de Carga y Rendimiento</w:t>
+              <w:br/>
+              <w:t>python backend/tests_carga/load_test.py</w:t>
+              <w:br/>
+              <w:br/>
+              <w:t># 3. Ejecutar Pruebas E2E Selenium (Modo Visión Real)</w:t>
+              <w:br/>
+              <w:t>python "scratch/ejecutar_e2e_master.py"</w:t>
+            </w:r>
+          </w:p>
+        </w:tc>
+      </w:tr>
+    </w:tbl>
+    <w:p>
+      <w:pPr>
+        <w:spacing w:after="80"/>
+      </w:pPr>
     </w:p>
     <w:p>
       <w:pPr>
-        <w:pStyle w:val="Heading2"/>
+        <w:spacing w:after="160" w:before="280"/>
+        <w:jc w:val="left"/>
       </w:pPr>
       <w:r>
         <w:rPr>
-          <w:rFonts w:ascii="Times New Roman" w:hAnsi="Times New Roman" w:eastAsia="Times New Roman"/>
+          <w:rFonts w:ascii="Arial" w:hAnsi="Arial"/>
           <w:b/>
           <w:i w:val="0"/>
-          <w:sz w:val="24"/>
+          <w:color w:val="1F3564"/>
+          <w:sz w:val="32"/>
         </w:rPr>
-        <w:t>5.3 Variables de entorno del backend</w:t>
-      </w:r>
-    </w:p>
-    <w:p>
-      <w:pPr>
-        <w:spacing w:after="120"/>
-        <w:jc w:val="both"/>
-      </w:pPr>
-      <w:r>
-        <w:rPr>
-          <w:rFonts w:ascii="Times New Roman" w:hAnsi="Times New Roman" w:eastAsia="Times New Roman"/>
-          <w:b w:val="0"/>
-          <w:i w:val="0"/>
-          <w:sz w:val="22"/>
-        </w:rPr>
-        <w:t>El backend carga automáticamente el archivo .env.local ubicado en la raíz del frontend (un nivel arriba de backend/) o un archivo .env. Variables mínimas:</w:t>
+        <w:t>7. Matriz de Solución de Problemas (Troubleshooting)</w:t>
       </w:r>
     </w:p>
     <w:tbl>
@@ -750,43 +1537,71 @@
         <w:tblLook w:firstColumn="1" w:firstRow="1" w:lastColumn="0" w:lastRow="0" w:noHBand="0" w:noVBand="1" w:val="04A0"/>
       </w:tblPr>
       <w:tblGrid>
-        <w:gridCol w:w="4536"/>
-        <w:gridCol w:w="4536"/>
+        <w:gridCol w:w="3135"/>
+        <w:gridCol w:w="3135"/>
+        <w:gridCol w:w="3135"/>
       </w:tblGrid>
       <w:tr>
         <w:tc>
           <w:tcPr>
-            <w:tcW w:type="dxa" w:w="4536"/>
-            <w:shd w:fill="1E3A5F" w:val="clear"/>
+            <w:tcW w:type="dxa" w:w="3135"/>
+            <w:shd w:val="clear" w:color="auto" w:fill="1F3564"/>
           </w:tcPr>
           <w:p>
+            <w:pPr>
+              <w:jc w:val="center"/>
+            </w:pPr>
             <w:r>
               <w:rPr>
-                <w:rFonts w:ascii="Times New Roman" w:hAnsi="Times New Roman" w:eastAsia="Times New Roman"/>
+                <w:rFonts w:ascii="Arial" w:hAnsi="Arial"/>
                 <w:b/>
                 <w:i w:val="0"/>
                 <w:color w:val="FFFFFF"/>
-                <w:sz w:val="18"/>
+                <w:sz w:val="20"/>
               </w:rPr>
-              <w:t>Variable</w:t>
+              <w:t>Síntoma / Error</w:t>
             </w:r>
           </w:p>
         </w:tc>
         <w:tc>
           <w:tcPr>
-            <w:tcW w:type="dxa" w:w="4536"/>
-            <w:shd w:fill="1E3A5F" w:val="clear"/>
+            <w:tcW w:type="dxa" w:w="3135"/>
+            <w:shd w:val="clear" w:color="auto" w:fill="1F3564"/>
           </w:tcPr>
           <w:p>
+            <w:pPr>
+              <w:jc w:val="center"/>
+            </w:pPr>
             <w:r>
               <w:rPr>
-                <w:rFonts w:ascii="Times New Roman" w:hAnsi="Times New Roman" w:eastAsia="Times New Roman"/>
+                <w:rFonts w:ascii="Arial" w:hAnsi="Arial"/>
                 <w:b/>
                 <w:i w:val="0"/>
                 <w:color w:val="FFFFFF"/>
-                <w:sz w:val="18"/>
+                <w:sz w:val="20"/>
               </w:rPr>
-              <w:t>Descripción</w:t>
+              <w:t>Causa Probable</w:t>
+            </w:r>
+          </w:p>
+        </w:tc>
+        <w:tc>
+          <w:tcPr>
+            <w:tcW w:type="dxa" w:w="3135"/>
+            <w:shd w:val="clear" w:color="auto" w:fill="1F3564"/>
+          </w:tcPr>
+          <w:p>
+            <w:pPr>
+              <w:jc w:val="center"/>
+            </w:pPr>
+            <w:r>
+              <w:rPr>
+                <w:rFonts w:ascii="Arial" w:hAnsi="Arial"/>
+                <w:b/>
+                <w:i w:val="0"/>
+                <w:color w:val="FFFFFF"/>
+                <w:sz w:val="20"/>
+              </w:rPr>
+              <w:t>Solución Recomendada</w:t>
             </w:r>
           </w:p>
         </w:tc>
@@ -794,33 +1609,52 @@
       <w:tr>
         <w:tc>
           <w:tcPr>
-            <w:tcW w:type="dxa" w:w="4536"/>
+            <w:tcW w:type="dxa" w:w="2835"/>
+            <w:vAlign w:val="center"/>
           </w:tcPr>
           <w:p>
             <w:r>
               <w:rPr>
-                <w:rFonts w:ascii="Times New Roman" w:hAnsi="Times New Roman" w:eastAsia="Times New Roman"/>
+                <w:rFonts w:ascii="Arial" w:hAnsi="Arial"/>
                 <w:b w:val="0"/>
                 <w:i w:val="0"/>
-                <w:sz w:val="18"/>
+                <w:sz w:val="19"/>
               </w:rPr>
-              <w:t>GOOGLE_API_KEY</w:t>
+              <w:t>CORS Error / Blocked by CORS policy</w:t>
             </w:r>
           </w:p>
         </w:tc>
         <w:tc>
           <w:tcPr>
-            <w:tcW w:type="dxa" w:w="4536"/>
+            <w:tcW w:type="dxa" w:w="2835"/>
+            <w:vAlign w:val="center"/>
           </w:tcPr>
           <w:p>
             <w:r>
               <w:rPr>
-                <w:rFonts w:ascii="Times New Roman" w:hAnsi="Times New Roman" w:eastAsia="Times New Roman"/>
+                <w:rFonts w:ascii="Arial" w:hAnsi="Arial"/>
                 <w:b w:val="0"/>
                 <w:i w:val="0"/>
-                <w:sz w:val="18"/>
+                <w:sz w:val="19"/>
               </w:rPr>
-              <w:t>Clave de Google AI (Gemini). Prioritaria.</w:t>
+              <w:t>CORS_ORIGINS en el backend no incluye el puerto 3000 o el dominio de Vercel.</w:t>
+            </w:r>
+          </w:p>
+        </w:tc>
+        <w:tc>
+          <w:tcPr>
+            <w:tcW w:type="dxa" w:w="3118"/>
+            <w:vAlign w:val="center"/>
+          </w:tcPr>
+          <w:p>
+            <w:r>
+              <w:rPr>
+                <w:rFonts w:ascii="Arial" w:hAnsi="Arial"/>
+                <w:b w:val="0"/>
+                <w:i w:val="0"/>
+                <w:sz w:val="19"/>
+              </w:rPr>
+              <w:t>Agregar http://localhost:3000 en backend/.env o main.py.</w:t>
             </w:r>
           </w:p>
         </w:tc>
@@ -828,33 +1662,52 @@
       <w:tr>
         <w:tc>
           <w:tcPr>
-            <w:tcW w:type="dxa" w:w="4536"/>
+            <w:tcW w:type="dxa" w:w="2835"/>
+            <w:vAlign w:val="center"/>
           </w:tcPr>
           <w:p>
             <w:r>
               <w:rPr>
-                <w:rFonts w:ascii="Times New Roman" w:hAnsi="Times New Roman" w:eastAsia="Times New Roman"/>
+                <w:rFonts w:ascii="Arial" w:hAnsi="Arial"/>
                 <w:b w:val="0"/>
                 <w:i w:val="0"/>
-                <w:sz w:val="18"/>
+                <w:sz w:val="19"/>
               </w:rPr>
-              <w:t>ANTHROPIC_API_KEY</w:t>
+              <w:t>TimeoutException en Selenium E2E</w:t>
             </w:r>
           </w:p>
         </w:tc>
         <w:tc>
           <w:tcPr>
-            <w:tcW w:type="dxa" w:w="4536"/>
+            <w:tcW w:type="dxa" w:w="2835"/>
+            <w:vAlign w:val="center"/>
           </w:tcPr>
           <w:p>
             <w:r>
               <w:rPr>
-                <w:rFonts w:ascii="Times New Roman" w:hAnsi="Times New Roman" w:eastAsia="Times New Roman"/>
+                <w:rFonts w:ascii="Arial" w:hAnsi="Arial"/>
                 <w:b w:val="0"/>
                 <w:i w:val="0"/>
-                <w:sz w:val="18"/>
+                <w:sz w:val="19"/>
               </w:rPr>
-              <w:t>Alternativa si no hay Gemini.</w:t>
+              <w:t>El servidor de Next.js estaba en arranque frío (cold-start) en la primera llamada.</w:t>
+            </w:r>
+          </w:p>
+        </w:tc>
+        <w:tc>
+          <w:tcPr>
+            <w:tcW w:type="dxa" w:w="3118"/>
+            <w:vAlign w:val="center"/>
+          </w:tcPr>
+          <w:p>
+            <w:r>
+              <w:rPr>
+                <w:rFonts w:ascii="Arial" w:hAnsi="Arial"/>
+                <w:b w:val="0"/>
+                <w:i w:val="0"/>
+                <w:sz w:val="19"/>
+              </w:rPr>
+              <w:t>El script incluye prewarming automático con urllib. Reintentar.</w:t>
             </w:r>
           </w:p>
         </w:tc>
@@ -862,530 +1715,52 @@
       <w:tr>
         <w:tc>
           <w:tcPr>
-            <w:tcW w:type="dxa" w:w="4536"/>
+            <w:tcW w:type="dxa" w:w="2835"/>
+            <w:vAlign w:val="center"/>
           </w:tcPr>
           <w:p>
             <w:r>
               <w:rPr>
-                <w:rFonts w:ascii="Times New Roman" w:hAnsi="Times New Roman" w:eastAsia="Times New Roman"/>
+                <w:rFonts w:ascii="Arial" w:hAnsi="Arial"/>
                 <w:b w:val="0"/>
                 <w:i w:val="0"/>
-                <w:sz w:val="18"/>
+                <w:sz w:val="19"/>
               </w:rPr>
-              <w:t>FIREBASE_CREDENTIALS</w:t>
+              <w:t>403 Rate Limit Exceeded en GitHub</w:t>
             </w:r>
           </w:p>
         </w:tc>
         <w:tc>
           <w:tcPr>
-            <w:tcW w:type="dxa" w:w="4536"/>
+            <w:tcW w:type="dxa" w:w="2835"/>
+            <w:vAlign w:val="center"/>
           </w:tcPr>
           <w:p>
             <w:r>
               <w:rPr>
-                <w:rFonts w:ascii="Times New Roman" w:hAnsi="Times New Roman" w:eastAsia="Times New Roman"/>
+                <w:rFonts w:ascii="Arial" w:hAnsi="Arial"/>
                 <w:b w:val="0"/>
                 <w:i w:val="0"/>
-                <w:sz w:val="18"/>
+                <w:sz w:val="19"/>
               </w:rPr>
-              <w:t>JSON del service account (producción).</w:t>
-            </w:r>
-          </w:p>
-        </w:tc>
-      </w:tr>
-    </w:tbl>
-    <w:p/>
-    <w:p>
-      <w:pPr>
-        <w:pStyle w:val="Heading2"/>
-      </w:pPr>
-      <w:r>
-        <w:rPr>
-          <w:rFonts w:ascii="Times New Roman" w:hAnsi="Times New Roman" w:eastAsia="Times New Roman"/>
-          <w:b/>
-          <w:i w:val="0"/>
-          <w:sz w:val="24"/>
-        </w:rPr>
-        <w:t>5.4 Ejecución</w:t>
-      </w:r>
-    </w:p>
-    <w:p>
-      <w:pPr>
-        <w:spacing w:after="120"/>
-        <w:jc w:val="both"/>
-      </w:pPr>
-      <w:r>
-        <w:rPr>
-          <w:rFonts w:ascii="Times New Roman" w:hAnsi="Times New Roman" w:eastAsia="Times New Roman"/>
-          <w:b w:val="0"/>
-          <w:i w:val="0"/>
-          <w:sz w:val="18"/>
-        </w:rPr>
-        <w:t>uvicorn main:app --reload --host 0.0.0.0 --port 8000</w:t>
-      </w:r>
-    </w:p>
-    <w:p>
-      <w:pPr>
-        <w:spacing w:after="120"/>
-        <w:jc w:val="both"/>
-      </w:pPr>
-      <w:r>
-        <w:rPr>
-          <w:rFonts w:ascii="Times New Roman" w:hAnsi="Times New Roman" w:eastAsia="Times New Roman"/>
-          <w:b w:val="0"/>
-          <w:i w:val="0"/>
-          <w:sz w:val="22"/>
-        </w:rPr>
-        <w:t>Verificación: abrir http://localhost:8000/docs (documentación OpenAPI de FastAPI).</w:t>
-      </w:r>
-    </w:p>
-    <w:p>
-      <w:pPr>
-        <w:pStyle w:val="Heading1"/>
-      </w:pPr>
-      <w:r>
-        <w:rPr>
-          <w:rFonts w:ascii="Times New Roman" w:hAnsi="Times New Roman" w:eastAsia="Times New Roman"/>
-          <w:b/>
-          <w:i w:val="0"/>
-          <w:sz w:val="28"/>
-        </w:rPr>
-        <w:t>6. Despliegue local — Frontend</w:t>
-      </w:r>
-    </w:p>
-    <w:p>
-      <w:pPr>
-        <w:pStyle w:val="Heading2"/>
-      </w:pPr>
-      <w:r>
-        <w:rPr>
-          <w:rFonts w:ascii="Times New Roman" w:hAnsi="Times New Roman" w:eastAsia="Times New Roman"/>
-          <w:b/>
-          <w:i w:val="0"/>
-          <w:sz w:val="24"/>
-        </w:rPr>
-        <w:t>6.1 Extracción e instalación</w:t>
-      </w:r>
-    </w:p>
-    <w:p>
-      <w:pPr>
-        <w:spacing w:after="120"/>
-        <w:jc w:val="both"/>
-      </w:pPr>
-      <w:r>
-        <w:rPr>
-          <w:rFonts w:ascii="Times New Roman" w:hAnsi="Times New Roman" w:eastAsia="Times New Roman"/>
-          <w:b w:val="0"/>
-          <w:i w:val="0"/>
-          <w:sz w:val="18"/>
-        </w:rPr>
-        <w:t>npm install</w:t>
-      </w:r>
-    </w:p>
-    <w:p>
-      <w:pPr>
-        <w:pStyle w:val="Heading2"/>
-      </w:pPr>
-      <w:r>
-        <w:rPr>
-          <w:rFonts w:ascii="Times New Roman" w:hAnsi="Times New Roman" w:eastAsia="Times New Roman"/>
-          <w:b/>
-          <w:i w:val="0"/>
-          <w:sz w:val="24"/>
-        </w:rPr>
-        <w:t>6.2 Archivo .env.local</w:t>
-      </w:r>
-    </w:p>
-    <w:p>
-      <w:pPr>
-        <w:spacing w:after="120"/>
-        <w:jc w:val="both"/>
-      </w:pPr>
-      <w:r>
-        <w:rPr>
-          <w:rFonts w:ascii="Times New Roman" w:hAnsi="Times New Roman" w:eastAsia="Times New Roman"/>
-          <w:b w:val="0"/>
-          <w:i w:val="0"/>
-          <w:sz w:val="22"/>
-        </w:rPr>
-        <w:t>Crear .env.local en la raíz del frontend con:</w:t>
-      </w:r>
-    </w:p>
-    <w:p>
-      <w:pPr>
-        <w:spacing w:after="120"/>
-        <w:jc w:val="both"/>
-      </w:pPr>
-      <w:r>
-        <w:rPr>
-          <w:rFonts w:ascii="Times New Roman" w:hAnsi="Times New Roman" w:eastAsia="Times New Roman"/>
-          <w:b w:val="0"/>
-          <w:i w:val="0"/>
-          <w:sz w:val="18"/>
-        </w:rPr>
-        <w:t>NEXT_PUBLIC_FIREBASE_API_KEY=...</w:t>
-        <w:br/>
-        <w:t>NEXT_PUBLIC_FIREBASE_AUTH_DOMAIN=...</w:t>
-        <w:br/>
-        <w:t>NEXT_PUBLIC_FIREBASE_PROJECT_ID=...</w:t>
-        <w:br/>
-        <w:t>NEXT_PUBLIC_FIREBASE_DATABASE_URL=...</w:t>
-        <w:br/>
-        <w:t>NEXT_PUBLIC_FIREBASE_STORAGE_BUCKET=...</w:t>
-        <w:br/>
-        <w:t>NEXT_PUBLIC_FIREBASE_MESSAGING_SENDER_ID=...</w:t>
-        <w:br/>
-        <w:t>NEXT_PUBLIC_FIREBASE_APP_ID=...</w:t>
-        <w:br/>
-        <w:t>NEXT_PUBLIC_FIREBASE_MEASUREMENT_ID=...</w:t>
-        <w:br/>
-        <w:t>BACKEND_URL=http://localhost:8000</w:t>
-        <w:br/>
-        <w:t>GOOGLE_API_KEY=...</w:t>
-      </w:r>
-    </w:p>
-    <w:p>
-      <w:pPr>
-        <w:pStyle w:val="Heading2"/>
-      </w:pPr>
-      <w:r>
-        <w:rPr>
-          <w:rFonts w:ascii="Times New Roman" w:hAnsi="Times New Roman" w:eastAsia="Times New Roman"/>
-          <w:b/>
-          <w:i w:val="0"/>
-          <w:sz w:val="24"/>
-        </w:rPr>
-        <w:t>6.3 Nota sobre middleware</w:t>
-      </w:r>
-    </w:p>
-    <w:p>
-      <w:pPr>
-        <w:spacing w:after="120"/>
-        <w:jc w:val="both"/>
-      </w:pPr>
-      <w:r>
-        <w:rPr>
-          <w:rFonts w:ascii="Times New Roman" w:hAnsi="Times New Roman" w:eastAsia="Times New Roman"/>
-          <w:b w:val="0"/>
-          <w:i w:val="0"/>
-          <w:sz w:val="22"/>
-        </w:rPr>
-        <w:t>El archivo middleware.ts permanece deshabilitado (middleware.ts.disabled) para evitar un conflicto de enrutamiento con Next.js 16 que provocaba respuestas 404 en rutas protegidas y API. La autenticación se gestiona mediante API Routes y cookies httpOnly.</w:t>
-      </w:r>
-    </w:p>
-    <w:p>
-      <w:pPr>
-        <w:pStyle w:val="Heading2"/>
-      </w:pPr>
-      <w:r>
-        <w:rPr>
-          <w:rFonts w:ascii="Times New Roman" w:hAnsi="Times New Roman" w:eastAsia="Times New Roman"/>
-          <w:b/>
-          <w:i w:val="0"/>
-          <w:sz w:val="24"/>
-        </w:rPr>
-        <w:t>6.4 Ejecución</w:t>
-      </w:r>
-    </w:p>
-    <w:p>
-      <w:pPr>
-        <w:spacing w:after="120"/>
-        <w:jc w:val="both"/>
-      </w:pPr>
-      <w:r>
-        <w:rPr>
-          <w:rFonts w:ascii="Times New Roman" w:hAnsi="Times New Roman" w:eastAsia="Times New Roman"/>
-          <w:b w:val="0"/>
-          <w:i w:val="0"/>
-          <w:sz w:val="18"/>
-        </w:rPr>
-        <w:t>npm run dev</w:t>
-      </w:r>
-    </w:p>
-    <w:p>
-      <w:pPr>
-        <w:spacing w:after="120"/>
-        <w:jc w:val="both"/>
-      </w:pPr>
-      <w:r>
-        <w:rPr>
-          <w:rFonts w:ascii="Times New Roman" w:hAnsi="Times New Roman" w:eastAsia="Times New Roman"/>
-          <w:b w:val="0"/>
-          <w:i w:val="0"/>
-          <w:sz w:val="22"/>
-        </w:rPr>
-        <w:t>Aplicación: http://localhost:3000</w:t>
-      </w:r>
-    </w:p>
-    <w:p>
-      <w:pPr>
-        <w:pStyle w:val="Heading1"/>
-      </w:pPr>
-      <w:r>
-        <w:rPr>
-          <w:rFonts w:ascii="Times New Roman" w:hAnsi="Times New Roman" w:eastAsia="Times New Roman"/>
-          <w:b/>
-          <w:i w:val="0"/>
-          <w:sz w:val="28"/>
-        </w:rPr>
-        <w:t>7. Orden de arranque recomendado</w:t>
-      </w:r>
-    </w:p>
-    <w:p>
-      <w:pPr>
-        <w:pStyle w:val="ListBullet"/>
-      </w:pPr>
-      <w:r>
-        <w:rPr>
-          <w:rFonts w:ascii="Times New Roman" w:hAnsi="Times New Roman" w:eastAsia="Times New Roman"/>
-          <w:b w:val="0"/>
-          <w:i w:val="0"/>
-          <w:sz w:val="22"/>
-        </w:rPr>
-        <w:t>1) Iniciar backend en :8000 y verificar /docs.</w:t>
-      </w:r>
-    </w:p>
-    <w:p>
-      <w:pPr>
-        <w:pStyle w:val="ListBullet"/>
-      </w:pPr>
-      <w:r>
-        <w:rPr>
-          <w:rFonts w:ascii="Times New Roman" w:hAnsi="Times New Roman" w:eastAsia="Times New Roman"/>
-          <w:b w:val="0"/>
-          <w:i w:val="0"/>
-          <w:sz w:val="22"/>
-        </w:rPr>
-        <w:t>2) Iniciar frontend en :3000.</w:t>
-      </w:r>
-    </w:p>
-    <w:p>
-      <w:pPr>
-        <w:pStyle w:val="ListBullet"/>
-      </w:pPr>
-      <w:r>
-        <w:rPr>
-          <w:rFonts w:ascii="Times New Roman" w:hAnsi="Times New Roman" w:eastAsia="Times New Roman"/>
-          <w:b w:val="0"/>
-          <w:i w:val="0"/>
-          <w:sz w:val="22"/>
-        </w:rPr>
-        <w:t>3) Iniciar sesión con un usuario Firebase (roles: estudiante, docente, administrador).</w:t>
-      </w:r>
-    </w:p>
-    <w:p>
-      <w:pPr>
-        <w:pStyle w:val="Heading1"/>
-      </w:pPr>
-      <w:r>
-        <w:rPr>
-          <w:rFonts w:ascii="Times New Roman" w:hAnsi="Times New Roman" w:eastAsia="Times New Roman"/>
-          <w:b/>
-          <w:i w:val="0"/>
-          <w:sz w:val="28"/>
-        </w:rPr>
-        <w:t>8. Despliegue en producción (referencia)</w:t>
-      </w:r>
-    </w:p>
-    <w:p>
-      <w:pPr>
-        <w:pStyle w:val="Heading2"/>
-      </w:pPr>
-      <w:r>
-        <w:rPr>
-          <w:rFonts w:ascii="Times New Roman" w:hAnsi="Times New Roman" w:eastAsia="Times New Roman"/>
-          <w:b/>
-          <w:i w:val="0"/>
-          <w:sz w:val="24"/>
-        </w:rPr>
-        <w:t>8.1 Backend (Railway / Render / VPS)</w:t>
-      </w:r>
-    </w:p>
-    <w:p>
-      <w:pPr>
-        <w:pStyle w:val="ListBullet"/>
-      </w:pPr>
-      <w:r>
-        <w:rPr>
-          <w:rFonts w:ascii="Times New Roman" w:hAnsi="Times New Roman" w:eastAsia="Times New Roman"/>
-          <w:b w:val="0"/>
-          <w:i w:val="0"/>
-          <w:sz w:val="22"/>
-        </w:rPr>
-        <w:t>Build: pip install -r requirements.txt</w:t>
-      </w:r>
-    </w:p>
-    <w:p>
-      <w:pPr>
-        <w:pStyle w:val="ListBullet"/>
-      </w:pPr>
-      <w:r>
-        <w:rPr>
-          <w:rFonts w:ascii="Times New Roman" w:hAnsi="Times New Roman" w:eastAsia="Times New Roman"/>
-          <w:b w:val="0"/>
-          <w:i w:val="0"/>
-          <w:sz w:val="22"/>
-        </w:rPr>
-        <w:t>Start: uvicorn main:app --host 0.0.0.0 --port $PORT</w:t>
-      </w:r>
-    </w:p>
-    <w:p>
-      <w:pPr>
-        <w:pStyle w:val="ListBullet"/>
-      </w:pPr>
-      <w:r>
-        <w:rPr>
-          <w:rFonts w:ascii="Times New Roman" w:hAnsi="Times New Roman" w:eastAsia="Times New Roman"/>
-          <w:b w:val="0"/>
-          <w:i w:val="0"/>
-          <w:sz w:val="22"/>
-        </w:rPr>
-        <w:t>Configurar FIREBASE_CREDENTIALS, GOOGLE_API_KEY (o ANTHROPIC_API_KEY) y CORS según origen del front.</w:t>
-      </w:r>
-    </w:p>
-    <w:p>
-      <w:pPr>
-        <w:pStyle w:val="ListBullet"/>
-      </w:pPr>
-      <w:r>
-        <w:rPr>
-          <w:rFonts w:ascii="Times New Roman" w:hAnsi="Times New Roman" w:eastAsia="Times New Roman"/>
-          <w:b w:val="0"/>
-          <w:i w:val="0"/>
-          <w:sz w:val="22"/>
-        </w:rPr>
-        <w:t>El repositorio incluye Procfile de referencia para plataformas PaaS.</w:t>
-      </w:r>
-    </w:p>
-    <w:p>
-      <w:pPr>
-        <w:pStyle w:val="Heading2"/>
-      </w:pPr>
-      <w:r>
-        <w:rPr>
-          <w:rFonts w:ascii="Times New Roman" w:hAnsi="Times New Roman" w:eastAsia="Times New Roman"/>
-          <w:b/>
-          <w:i w:val="0"/>
-          <w:sz w:val="24"/>
-        </w:rPr>
-        <w:t>8.2 Frontend (Vercel u otro host Node)</w:t>
-      </w:r>
-    </w:p>
-    <w:p>
-      <w:pPr>
-        <w:pStyle w:val="ListBullet"/>
-      </w:pPr>
-      <w:r>
-        <w:rPr>
-          <w:rFonts w:ascii="Times New Roman" w:hAnsi="Times New Roman" w:eastAsia="Times New Roman"/>
-          <w:b w:val="0"/>
-          <w:i w:val="0"/>
-          <w:sz w:val="22"/>
-        </w:rPr>
-        <w:t>Build: npm run build</w:t>
-      </w:r>
-    </w:p>
-    <w:p>
-      <w:pPr>
-        <w:pStyle w:val="ListBullet"/>
-      </w:pPr>
-      <w:r>
-        <w:rPr>
-          <w:rFonts w:ascii="Times New Roman" w:hAnsi="Times New Roman" w:eastAsia="Times New Roman"/>
-          <w:b w:val="0"/>
-          <w:i w:val="0"/>
-          <w:sz w:val="22"/>
-        </w:rPr>
-        <w:t>Start: npm run start</w:t>
-      </w:r>
-    </w:p>
-    <w:p>
-      <w:pPr>
-        <w:pStyle w:val="ListBullet"/>
-      </w:pPr>
-      <w:r>
-        <w:rPr>
-          <w:rFonts w:ascii="Times New Roman" w:hAnsi="Times New Roman" w:eastAsia="Times New Roman"/>
-          <w:b w:val="0"/>
-          <w:i w:val="0"/>
-          <w:sz w:val="22"/>
-        </w:rPr>
-        <w:t>Definir todas las variables NEXT_PUBLIC_FIREBASE_* y BACKEND_URL apuntando al backend público (HTTPS).</w:t>
-      </w:r>
-    </w:p>
-    <w:p>
-      <w:pPr>
-        <w:pStyle w:val="ListBullet"/>
-      </w:pPr>
-      <w:r>
-        <w:rPr>
-          <w:rFonts w:ascii="Times New Roman" w:hAnsi="Times New Roman" w:eastAsia="Times New Roman"/>
-          <w:b w:val="0"/>
-          <w:i w:val="0"/>
-          <w:sz w:val="22"/>
-        </w:rPr>
-        <w:t>Habilitar cookie secure en producción (NODE_ENV=production).</w:t>
-      </w:r>
-    </w:p>
-    <w:p>
-      <w:pPr>
-        <w:pStyle w:val="Heading1"/>
-      </w:pPr>
-      <w:r>
-        <w:rPr>
-          <w:rFonts w:ascii="Times New Roman" w:hAnsi="Times New Roman" w:eastAsia="Times New Roman"/>
-          <w:b/>
-          <w:i w:val="0"/>
-          <w:sz w:val="28"/>
-        </w:rPr>
-        <w:t>9. Verificación post-despliegue</w:t>
-      </w:r>
-    </w:p>
-    <w:tbl>
-      <w:tblPr>
-        <w:tblStyle w:val="TableGrid"/>
-        <w:tblW w:type="auto" w:w="0"/>
-        <w:jc w:val="center"/>
-        <w:tblLook w:firstColumn="1" w:firstRow="1" w:lastColumn="0" w:lastRow="0" w:noHBand="0" w:noVBand="1" w:val="04A0"/>
-      </w:tblPr>
-      <w:tblGrid>
-        <w:gridCol w:w="4536"/>
-        <w:gridCol w:w="4536"/>
-      </w:tblGrid>
-      <w:tr>
-        <w:tc>
-          <w:tcPr>
-            <w:tcW w:type="dxa" w:w="4536"/>
-            <w:shd w:fill="1E3A5F" w:val="clear"/>
-          </w:tcPr>
-          <w:p>
-            <w:r>
-              <w:rPr>
-                <w:rFonts w:ascii="Times New Roman" w:hAnsi="Times New Roman" w:eastAsia="Times New Roman"/>
-                <w:b/>
-                <w:i w:val="0"/>
-                <w:color w:val="FFFFFF"/>
-                <w:sz w:val="18"/>
-              </w:rPr>
-              <w:t>Prueba</w:t>
+              <w:t>No se configuró GITHUB_TOKEN en el backend.</w:t>
             </w:r>
           </w:p>
         </w:tc>
         <w:tc>
           <w:tcPr>
-            <w:tcW w:type="dxa" w:w="4536"/>
-            <w:shd w:fill="1E3A5F" w:val="clear"/>
+            <w:tcW w:type="dxa" w:w="3118"/>
+            <w:vAlign w:val="center"/>
           </w:tcPr>
           <w:p>
             <w:r>
               <w:rPr>
-                <w:rFonts w:ascii="Times New Roman" w:hAnsi="Times New Roman" w:eastAsia="Times New Roman"/>
-                <w:b/>
+                <w:rFonts w:ascii="Arial" w:hAnsi="Arial"/>
+                <w:b w:val="0"/>
                 <w:i w:val="0"/>
-                <w:color w:val="FFFFFF"/>
-                <w:sz w:val="18"/>
+                <w:sz w:val="19"/>
               </w:rPr>
-              <w:t>Resultado esperado</w:t>
+              <w:t>Crear Personal Access Token (PAT) en GitHub y agregarlo en .env.</w:t>
             </w:r>
           </w:p>
         </w:tc>
@@ -1393,568 +1768,60 @@
       <w:tr>
         <w:tc>
           <w:tcPr>
-            <w:tcW w:type="dxa" w:w="4536"/>
+            <w:tcW w:type="dxa" w:w="2835"/>
+            <w:vAlign w:val="center"/>
           </w:tcPr>
           <w:p>
             <w:r>
               <w:rPr>
-                <w:rFonts w:ascii="Times New Roman" w:hAnsi="Times New Roman" w:eastAsia="Times New Roman"/>
+                <w:rFonts w:ascii="Arial" w:hAnsi="Arial"/>
                 <w:b w:val="0"/>
                 <w:i w:val="0"/>
-                <w:sz w:val="18"/>
+                <w:sz w:val="19"/>
               </w:rPr>
-              <w:t>GET backend /docs</w:t>
+              <w:t>Firebase Auth Auth/invalid-credential</w:t>
             </w:r>
           </w:p>
         </w:tc>
         <w:tc>
           <w:tcPr>
-            <w:tcW w:type="dxa" w:w="4536"/>
+            <w:tcW w:type="dxa" w:w="2835"/>
+            <w:vAlign w:val="center"/>
           </w:tcPr>
           <w:p>
             <w:r>
               <w:rPr>
-                <w:rFonts w:ascii="Times New Roman" w:hAnsi="Times New Roman" w:eastAsia="Times New Roman"/>
+                <w:rFonts w:ascii="Arial" w:hAnsi="Arial"/>
                 <w:b w:val="0"/>
                 <w:i w:val="0"/>
-                <w:sz w:val="18"/>
+                <w:sz w:val="19"/>
               </w:rPr>
-              <w:t>Swagger UI visible</w:t>
-            </w:r>
-          </w:p>
-        </w:tc>
-      </w:tr>
-      <w:tr>
-        <w:tc>
-          <w:tcPr>
-            <w:tcW w:type="dxa" w:w="4536"/>
-          </w:tcPr>
-          <w:p>
-            <w:r>
-              <w:rPr>
-                <w:rFonts w:ascii="Times New Roman" w:hAnsi="Times New Roman" w:eastAsia="Times New Roman"/>
-                <w:b w:val="0"/>
-                <w:i w:val="0"/>
-                <w:sz w:val="18"/>
-              </w:rPr>
-              <w:t>Login en /</w:t>
+              <w:t>El usuario no existe o se seleccionó el Modo de Autenticación equivocado (Google vs Correo).</w:t>
             </w:r>
           </w:p>
         </w:tc>
         <w:tc>
           <w:tcPr>
-            <w:tcW w:type="dxa" w:w="4536"/>
+            <w:tcW w:type="dxa" w:w="3118"/>
+            <w:vAlign w:val="center"/>
           </w:tcPr>
           <w:p>
             <w:r>
               <w:rPr>
-                <w:rFonts w:ascii="Times New Roman" w:hAnsi="Times New Roman" w:eastAsia="Times New Roman"/>
+                <w:rFonts w:ascii="Arial" w:hAnsi="Arial"/>
                 <w:b w:val="0"/>
                 <w:i w:val="0"/>
-                <w:sz w:val="18"/>
+                <w:sz w:val="19"/>
               </w:rPr>
-              <w:t>Redirección según rol</w:t>
-            </w:r>
-          </w:p>
-        </w:tc>
-      </w:tr>
-      <w:tr>
-        <w:tc>
-          <w:tcPr>
-            <w:tcW w:type="dxa" w:w="4536"/>
-          </w:tcPr>
-          <w:p>
-            <w:r>
-              <w:rPr>
-                <w:rFonts w:ascii="Times New Roman" w:hAnsi="Times New Roman" w:eastAsia="Times New Roman"/>
-                <w:b w:val="0"/>
-                <w:i w:val="0"/>
-                <w:sz w:val="18"/>
-              </w:rPr>
-              <w:t>Estudiante → Analizar</w:t>
-            </w:r>
-          </w:p>
-        </w:tc>
-        <w:tc>
-          <w:tcPr>
-            <w:tcW w:type="dxa" w:w="4536"/>
-          </w:tcPr>
-          <w:p>
-            <w:r>
-              <w:rPr>
-                <w:rFonts w:ascii="Times New Roman" w:hAnsi="Times New Roman" w:eastAsia="Times New Roman"/>
-                <w:b w:val="0"/>
-                <w:i w:val="0"/>
-                <w:sz w:val="18"/>
-              </w:rPr>
-              <w:t>Tracking completed + Kanban actualizado</w:t>
-            </w:r>
-          </w:p>
-        </w:tc>
-      </w:tr>
-      <w:tr>
-        <w:tc>
-          <w:tcPr>
-            <w:tcW w:type="dxa" w:w="4536"/>
-          </w:tcPr>
-          <w:p>
-            <w:r>
-              <w:rPr>
-                <w:rFonts w:ascii="Times New Roman" w:hAnsi="Times New Roman" w:eastAsia="Times New Roman"/>
-                <w:b w:val="0"/>
-                <w:i w:val="0"/>
-                <w:sz w:val="18"/>
-              </w:rPr>
-              <w:t>Docente → Analítica</w:t>
-            </w:r>
-          </w:p>
-        </w:tc>
-        <w:tc>
-          <w:tcPr>
-            <w:tcW w:type="dxa" w:w="4536"/>
-          </w:tcPr>
-          <w:p>
-            <w:r>
-              <w:rPr>
-                <w:rFonts w:ascii="Times New Roman" w:hAnsi="Times New Roman" w:eastAsia="Times New Roman"/>
-                <w:b w:val="0"/>
-                <w:i w:val="0"/>
-                <w:sz w:val="18"/>
-              </w:rPr>
-              <w:t>Score, commits y competencias visibles</w:t>
-            </w:r>
-          </w:p>
-        </w:tc>
-      </w:tr>
-      <w:tr>
-        <w:tc>
-          <w:tcPr>
-            <w:tcW w:type="dxa" w:w="4536"/>
-          </w:tcPr>
-          <w:p>
-            <w:r>
-              <w:rPr>
-                <w:rFonts w:ascii="Times New Roman" w:hAnsi="Times New Roman" w:eastAsia="Times New Roman"/>
-                <w:b w:val="0"/>
-                <w:i w:val="0"/>
-                <w:sz w:val="18"/>
-              </w:rPr>
-              <w:t>Docente → Auditoría CSV</w:t>
-            </w:r>
-          </w:p>
-        </w:tc>
-        <w:tc>
-          <w:tcPr>
-            <w:tcW w:type="dxa" w:w="4536"/>
-          </w:tcPr>
-          <w:p>
-            <w:r>
-              <w:rPr>
-                <w:rFonts w:ascii="Times New Roman" w:hAnsi="Times New Roman" w:eastAsia="Times New Roman"/>
-                <w:b w:val="0"/>
-                <w:i w:val="0"/>
-                <w:sz w:val="18"/>
-              </w:rPr>
-              <w:t>Semáforo solo-reporte (no altera Kanban)</w:t>
+              <w:t>Verificar el modo en el Panel de Administración o pre-registrar la cuenta.</w:t>
             </w:r>
           </w:p>
         </w:tc>
       </w:tr>
     </w:tbl>
-    <w:p/>
-    <w:p>
-      <w:pPr>
-        <w:pStyle w:val="Heading1"/>
-      </w:pPr>
-      <w:r>
-        <w:rPr>
-          <w:rFonts w:ascii="Times New Roman" w:hAnsi="Times New Roman" w:eastAsia="Times New Roman"/>
-          <w:b/>
-          <w:i w:val="0"/>
-          <w:sz w:val="28"/>
-        </w:rPr>
-        <w:t>10. Solución de problemas frecuentes</w:t>
-      </w:r>
-    </w:p>
-    <w:tbl>
-      <w:tblPr>
-        <w:tblStyle w:val="TableGrid"/>
-        <w:tblW w:type="auto" w:w="0"/>
-        <w:jc w:val="center"/>
-        <w:tblLook w:firstColumn="1" w:firstRow="1" w:lastColumn="0" w:lastRow="0" w:noHBand="0" w:noVBand="1" w:val="04A0"/>
-      </w:tblPr>
-      <w:tblGrid>
-        <w:gridCol w:w="3024"/>
-        <w:gridCol w:w="3024"/>
-        <w:gridCol w:w="3024"/>
-      </w:tblGrid>
-      <w:tr>
-        <w:tc>
-          <w:tcPr>
-            <w:tcW w:type="dxa" w:w="3024"/>
-            <w:shd w:fill="1E3A5F" w:val="clear"/>
-          </w:tcPr>
-          <w:p>
-            <w:r>
-              <w:rPr>
-                <w:rFonts w:ascii="Times New Roman" w:hAnsi="Times New Roman" w:eastAsia="Times New Roman"/>
-                <w:b/>
-                <w:i w:val="0"/>
-                <w:color w:val="FFFFFF"/>
-                <w:sz w:val="18"/>
-              </w:rPr>
-              <w:t>Síntoma</w:t>
-            </w:r>
-          </w:p>
-        </w:tc>
-        <w:tc>
-          <w:tcPr>
-            <w:tcW w:type="dxa" w:w="3024"/>
-            <w:shd w:fill="1E3A5F" w:val="clear"/>
-          </w:tcPr>
-          <w:p>
-            <w:r>
-              <w:rPr>
-                <w:rFonts w:ascii="Times New Roman" w:hAnsi="Times New Roman" w:eastAsia="Times New Roman"/>
-                <w:b/>
-                <w:i w:val="0"/>
-                <w:color w:val="FFFFFF"/>
-                <w:sz w:val="18"/>
-              </w:rPr>
-              <w:t>Causa probable</w:t>
-            </w:r>
-          </w:p>
-        </w:tc>
-        <w:tc>
-          <w:tcPr>
-            <w:tcW w:type="dxa" w:w="3024"/>
-            <w:shd w:fill="1E3A5F" w:val="clear"/>
-          </w:tcPr>
-          <w:p>
-            <w:r>
-              <w:rPr>
-                <w:rFonts w:ascii="Times New Roman" w:hAnsi="Times New Roman" w:eastAsia="Times New Roman"/>
-                <w:b/>
-                <w:i w:val="0"/>
-                <w:color w:val="FFFFFF"/>
-                <w:sz w:val="18"/>
-              </w:rPr>
-              <w:t>Acción</w:t>
-            </w:r>
-          </w:p>
-        </w:tc>
-      </w:tr>
-      <w:tr>
-        <w:tc>
-          <w:tcPr>
-            <w:tcW w:type="dxa" w:w="3024"/>
-          </w:tcPr>
-          <w:p>
-            <w:r>
-              <w:rPr>
-                <w:rFonts w:ascii="Times New Roman" w:hAnsi="Times New Roman" w:eastAsia="Times New Roman"/>
-                <w:b w:val="0"/>
-                <w:i w:val="0"/>
-                <w:sz w:val="18"/>
-              </w:rPr>
-              <w:t>404 en /dashboard o /api/*</w:t>
-            </w:r>
-          </w:p>
-        </w:tc>
-        <w:tc>
-          <w:tcPr>
-            <w:tcW w:type="dxa" w:w="3024"/>
-          </w:tcPr>
-          <w:p>
-            <w:r>
-              <w:rPr>
-                <w:rFonts w:ascii="Times New Roman" w:hAnsi="Times New Roman" w:eastAsia="Times New Roman"/>
-                <w:b w:val="0"/>
-                <w:i w:val="0"/>
-                <w:sz w:val="18"/>
-              </w:rPr>
-              <w:t>middleware conflictivo</w:t>
-            </w:r>
-          </w:p>
-        </w:tc>
-        <w:tc>
-          <w:tcPr>
-            <w:tcW w:type="dxa" w:w="3024"/>
-          </w:tcPr>
-          <w:p>
-            <w:r>
-              <w:rPr>
-                <w:rFonts w:ascii="Times New Roman" w:hAnsi="Times New Roman" w:eastAsia="Times New Roman"/>
-                <w:b w:val="0"/>
-                <w:i w:val="0"/>
-                <w:sz w:val="18"/>
-              </w:rPr>
-              <w:t>Mantener middleware.ts.disabled</w:t>
-            </w:r>
-          </w:p>
-        </w:tc>
-      </w:tr>
-      <w:tr>
-        <w:tc>
-          <w:tcPr>
-            <w:tcW w:type="dxa" w:w="3024"/>
-          </w:tcPr>
-          <w:p>
-            <w:r>
-              <w:rPr>
-                <w:rFonts w:ascii="Times New Roman" w:hAnsi="Times New Roman" w:eastAsia="Times New Roman"/>
-                <w:b w:val="0"/>
-                <w:i w:val="0"/>
-                <w:sz w:val="18"/>
-              </w:rPr>
-              <w:t>Agentes en modo simulación</w:t>
-            </w:r>
-          </w:p>
-        </w:tc>
-        <w:tc>
-          <w:tcPr>
-            <w:tcW w:type="dxa" w:w="3024"/>
-          </w:tcPr>
-          <w:p>
-            <w:r>
-              <w:rPr>
-                <w:rFonts w:ascii="Times New Roman" w:hAnsi="Times New Roman" w:eastAsia="Times New Roman"/>
-                <w:b w:val="0"/>
-                <w:i w:val="0"/>
-                <w:sz w:val="18"/>
-              </w:rPr>
-              <w:t>Falta GOOGLE_API_KEY</w:t>
-            </w:r>
-          </w:p>
-        </w:tc>
-        <w:tc>
-          <w:tcPr>
-            <w:tcW w:type="dxa" w:w="3024"/>
-          </w:tcPr>
-          <w:p>
-            <w:r>
-              <w:rPr>
-                <w:rFonts w:ascii="Times New Roman" w:hAnsi="Times New Roman" w:eastAsia="Times New Roman"/>
-                <w:b w:val="0"/>
-                <w:i w:val="0"/>
-                <w:sz w:val="18"/>
-              </w:rPr>
-              <w:t>Configurar clave Gemini</w:t>
-            </w:r>
-          </w:p>
-        </w:tc>
-      </w:tr>
-      <w:tr>
-        <w:tc>
-          <w:tcPr>
-            <w:tcW w:type="dxa" w:w="3024"/>
-          </w:tcPr>
-          <w:p>
-            <w:r>
-              <w:rPr>
-                <w:rFonts w:ascii="Times New Roman" w:hAnsi="Times New Roman" w:eastAsia="Times New Roman"/>
-                <w:b w:val="0"/>
-                <w:i w:val="0"/>
-                <w:sz w:val="18"/>
-              </w:rPr>
-              <w:t>Error Firebase Admin</w:t>
-            </w:r>
-          </w:p>
-        </w:tc>
-        <w:tc>
-          <w:tcPr>
-            <w:tcW w:type="dxa" w:w="3024"/>
-          </w:tcPr>
-          <w:p>
-            <w:r>
-              <w:rPr>
-                <w:rFonts w:ascii="Times New Roman" w:hAnsi="Times New Roman" w:eastAsia="Times New Roman"/>
-                <w:b w:val="0"/>
-                <w:i w:val="0"/>
-                <w:sz w:val="18"/>
-              </w:rPr>
-              <w:t>Falta serviceAccountKey.json</w:t>
-            </w:r>
-          </w:p>
-        </w:tc>
-        <w:tc>
-          <w:tcPr>
-            <w:tcW w:type="dxa" w:w="3024"/>
-          </w:tcPr>
-          <w:p>
-            <w:r>
-              <w:rPr>
-                <w:rFonts w:ascii="Times New Roman" w:hAnsi="Times New Roman" w:eastAsia="Times New Roman"/>
-                <w:b w:val="0"/>
-                <w:i w:val="0"/>
-                <w:sz w:val="18"/>
-              </w:rPr>
-              <w:t>Colocar JSON o FIREBASE_CREDENTIALS</w:t>
-            </w:r>
-          </w:p>
-        </w:tc>
-      </w:tr>
-      <w:tr>
-        <w:tc>
-          <w:tcPr>
-            <w:tcW w:type="dxa" w:w="3024"/>
-          </w:tcPr>
-          <w:p>
-            <w:r>
-              <w:rPr>
-                <w:rFonts w:ascii="Times New Roman" w:hAnsi="Times New Roman" w:eastAsia="Times New Roman"/>
-                <w:b w:val="0"/>
-                <w:i w:val="0"/>
-                <w:sz w:val="18"/>
-              </w:rPr>
-              <w:t>Front no habla con API</w:t>
-            </w:r>
-          </w:p>
-        </w:tc>
-        <w:tc>
-          <w:tcPr>
-            <w:tcW w:type="dxa" w:w="3024"/>
-          </w:tcPr>
-          <w:p>
-            <w:r>
-              <w:rPr>
-                <w:rFonts w:ascii="Times New Roman" w:hAnsi="Times New Roman" w:eastAsia="Times New Roman"/>
-                <w:b w:val="0"/>
-                <w:i w:val="0"/>
-                <w:sz w:val="18"/>
-              </w:rPr>
-              <w:t>BACKEND_URL incorrecta</w:t>
-            </w:r>
-          </w:p>
-        </w:tc>
-        <w:tc>
-          <w:tcPr>
-            <w:tcW w:type="dxa" w:w="3024"/>
-          </w:tcPr>
-          <w:p>
-            <w:r>
-              <w:rPr>
-                <w:rFonts w:ascii="Times New Roman" w:hAnsi="Times New Roman" w:eastAsia="Times New Roman"/>
-                <w:b w:val="0"/>
-                <w:i w:val="0"/>
-                <w:sz w:val="18"/>
-              </w:rPr>
-              <w:t>Revisar .env.local</w:t>
-            </w:r>
-          </w:p>
-        </w:tc>
-      </w:tr>
-      <w:tr>
-        <w:tc>
-          <w:tcPr>
-            <w:tcW w:type="dxa" w:w="3024"/>
-          </w:tcPr>
-          <w:p>
-            <w:r>
-              <w:rPr>
-                <w:rFonts w:ascii="Times New Roman" w:hAnsi="Times New Roman" w:eastAsia="Times New Roman"/>
-                <w:b w:val="0"/>
-                <w:i w:val="0"/>
-                <w:sz w:val="18"/>
-              </w:rPr>
-              <w:t>Repo GitHub vacío en análisis</w:t>
-            </w:r>
-          </w:p>
-        </w:tc>
-        <w:tc>
-          <w:tcPr>
-            <w:tcW w:type="dxa" w:w="3024"/>
-          </w:tcPr>
-          <w:p>
-            <w:r>
-              <w:rPr>
-                <w:rFonts w:ascii="Times New Roman" w:hAnsi="Times New Roman" w:eastAsia="Times New Roman"/>
-                <w:b w:val="0"/>
-                <w:i w:val="0"/>
-                <w:sz w:val="18"/>
-              </w:rPr>
-              <w:t>URL inválida o rate limit</w:t>
-            </w:r>
-          </w:p>
-        </w:tc>
-        <w:tc>
-          <w:tcPr>
-            <w:tcW w:type="dxa" w:w="3024"/>
-          </w:tcPr>
-          <w:p>
-            <w:r>
-              <w:rPr>
-                <w:rFonts w:ascii="Times New Roman" w:hAnsi="Times New Roman" w:eastAsia="Times New Roman"/>
-                <w:b w:val="0"/>
-                <w:i w:val="0"/>
-                <w:sz w:val="18"/>
-              </w:rPr>
-              <w:t>Verificar repo público / token</w:t>
-            </w:r>
-          </w:p>
-        </w:tc>
-      </w:tr>
-    </w:tbl>
-    <w:p/>
-    <w:p>
-      <w:pPr>
-        <w:pStyle w:val="Heading1"/>
-      </w:pPr>
-      <w:r>
-        <w:rPr>
-          <w:rFonts w:ascii="Times New Roman" w:hAnsi="Times New Roman" w:eastAsia="Times New Roman"/>
-          <w:b/>
-          <w:i w:val="0"/>
-          <w:sz w:val="28"/>
-        </w:rPr>
-        <w:t>11. Seguridad</w:t>
-      </w:r>
-    </w:p>
-    <w:p>
-      <w:pPr>
-        <w:pStyle w:val="ListBullet"/>
-      </w:pPr>
-      <w:r>
-        <w:rPr>
-          <w:rFonts w:ascii="Times New Roman" w:hAnsi="Times New Roman" w:eastAsia="Times New Roman"/>
-          <w:b w:val="0"/>
-          <w:i w:val="0"/>
-          <w:sz w:val="22"/>
-        </w:rPr>
-        <w:t>No versionar .env.local ni serviceAccountKey.json.</w:t>
-      </w:r>
-    </w:p>
-    <w:p>
-      <w:pPr>
-        <w:pStyle w:val="ListBullet"/>
-      </w:pPr>
-      <w:r>
-        <w:rPr>
-          <w:rFonts w:ascii="Times New Roman" w:hAnsi="Times New Roman" w:eastAsia="Times New Roman"/>
-          <w:b w:val="0"/>
-          <w:i w:val="0"/>
-          <w:sz w:val="22"/>
-        </w:rPr>
-        <w:t>Los ZIP de entrega no incluyen secretos ni node_modules / .venv.</w:t>
-      </w:r>
-    </w:p>
-    <w:p>
-      <w:pPr>
-        <w:pStyle w:val="ListBullet"/>
-      </w:pPr>
-      <w:r>
-        <w:rPr>
-          <w:rFonts w:ascii="Times New Roman" w:hAnsi="Times New Roman" w:eastAsia="Times New Roman"/>
-          <w:b w:val="0"/>
-          <w:i w:val="0"/>
-          <w:sz w:val="22"/>
-        </w:rPr>
-        <w:t>Rotar claves si se compartieron accidentalmente.</w:t>
-      </w:r>
-    </w:p>
     <w:sectPr>
       <w:pgSz w:w="12240" w:h="15840"/>
-      <w:pgMar w:top="1440" w:right="1584" w:bottom="1440" w:left="1584" w:header="720" w:footer="720" w:gutter="0"/>
+      <w:pgMar w:top="1417" w:right="1417" w:bottom="1417" w:left="1417" w:header="720" w:footer="720" w:gutter="0"/>
       <w:cols w:space="720"/>
       <w:docGrid w:linePitch="360"/>
     </w:sectPr>

</xml_diff>